<commit_message>
fix(receptionist): block appointment changes while in room
</commit_message>
<xml_diff>
--- a/docs/Le tan/Ke hoach xu ly loi actor Le tan 2026-08-02.docx
+++ b/docs/Le tan/Ke hoach xu ly loi actor Le tan 2026-08-02.docx
@@ -7417,6 +7417,23 @@
           <w:szCs w:val="22"/>
         </w:rPr>
         <w:t xml:space="preserve">Mức ưu tiên: P0. Phụ thuộc: LT-00, LT-09.</w:t>
+      </w:r>
+    </w:p>
+    <w:p>
+      <w:pPr>
+        <w:spacing w:before="80" w:after="80"/>
+      </w:pPr>
+      <w:r>
+        <w:rPr>
+          <w:rFonts w:ascii="Arial" w:cs="Arial" w:eastAsia="Arial" w:hAnsi="Arial"/>
+          <w:b w:val="false"/>
+          <w:bCs w:val="false"/>
+          <w:i w:val="false"/>
+          <w:iCs w:val="false"/>
+          <w:sz w:val="22"/>
+          <w:szCs w:val="22"/>
+        </w:rPr>
+        <w:t xml:space="preserve">Tình trạng triển khai 2026-08-02: đã khóa các thao tác lễ tân có thể làm lệch lịch khi bệnh nhân đã vào hàng đợi hoặc đang trong phòng. reschedule và cancel dùng assertReceptionistAppointmentAction() nên bị chặn khi LichHen.status='in_progress' hoặc HangDoi.trang_thai='trong_phong'; frontend nhận allowed_actions=[] và lock_reason từ backend. Luồng thanh toán mock của lễ tân cũng được gia cố: chỉ tạo/xác nhận QR khi lịch còn pending, tránh ghi đè nhầm lịch đã check-in/đang khám về confirmed.</w:t>
       </w:r>
     </w:p>
     <w:p>

</xml_diff>

<commit_message>
feat(receptionist): assign check-in queue numbers
</commit_message>
<xml_diff>
--- a/docs/Le tan/Ke hoach xu ly loi actor Le tan 2026-08-02.docx
+++ b/docs/Le tan/Ke hoach xu ly loi actor Le tan 2026-08-02.docx
@@ -7625,6 +7625,23 @@
           <w:szCs w:val="22"/>
         </w:rPr>
         <w:t xml:space="preserve">Mức ưu tiên: P0. Phụ thuộc: LT-00.</w:t>
+      </w:r>
+    </w:p>
+    <w:p>
+      <w:pPr>
+        <w:spacing w:before="80" w:after="80"/>
+      </w:pPr>
+      <w:r>
+        <w:rPr>
+          <w:rFonts w:ascii="Arial" w:cs="Arial" w:eastAsia="Arial" w:hAnsi="Arial"/>
+          <w:b w:val="false"/>
+          <w:bCs w:val="false"/>
+          <w:i w:val="false"/>
+          <w:iCs w:val="false"/>
+          <w:sz w:val="22"/>
+          <w:szCs w:val="22"/>
+        </w:rPr>
+        <w:t xml:space="preserve">Tình trạng triển khai 2026-08-02: đã thêm số thứ tự check-in cố định trên HangDoi: ngay_checkin_key, so_thu_tu_checkin, ma_so_thu_tu. Số được sinh bằng Counter theo từng ngày (checkin:YYYY-MM-DD) cho cả lịch online khi lễ tân check-in và lượt walk-in tại quầy; index unique theo ngày + số giúp chống trùng khi nhiều lễ tân thao tác đồng thời. API check-in, tra cứu hồ sơ và danh sách queue trả mã số này; màn tiếp nhận lễ tân hiển thị mã sau khi check-in. Thứ tự gọi khám vẫn giữ thuật toán động hiện có, không dùng số thứ tự cố định để xếp ưu tiên.</w:t>
       </w:r>
     </w:p>
     <w:p>

</xml_diff>

<commit_message>
feat(receptionist): show doctor operational statuses
</commit_message>
<xml_diff>
--- a/docs/Le tan/Ke hoach xu ly loi actor Le tan 2026-08-02.docx
+++ b/docs/Le tan/Ke hoach xu ly loi actor Le tan 2026-08-02.docx
@@ -9254,6 +9254,23 @@
           <w:szCs w:val="22"/>
         </w:rPr>
         <w:t xml:space="preserve">Mức ưu tiên: P1. Phụ thuộc: LT-00, LT-03, LT-06.</w:t>
+      </w:r>
+    </w:p>
+    <w:p>
+      <w:pPr>
+        <w:spacing w:before="80" w:after="80"/>
+      </w:pPr>
+      <w:r>
+        <w:rPr>
+          <w:rFonts w:ascii="Arial" w:cs="Arial" w:eastAsia="Arial" w:hAnsi="Arial"/>
+          <w:b w:val="false"/>
+          <w:bCs w:val="false"/>
+          <w:i w:val="false"/>
+          <w:iCs w:val="false"/>
+          <w:sz w:val="22"/>
+          <w:szCs w:val="22"/>
+        </w:rPr>
+        <w:t xml:space="preserve">Tình trạng triển khai 2026-08-02: đã thêm API đọc-only cho lễ tân tại /receptionist/appointments/doctor-statuses để tổng hợp trạng thái vận hành bác sĩ trong ngày từ BacSi, LichLamViec, TrangThaiPhongKham và HangDoi. Dashboard lễ tân đã có khung “Trạng thái vận hành bác sĩ”, hiển thị bác sĩ sẵn sàng/đang khám/tạm nghỉ/dọn phòng/không có lịch, số lượt đang chờ, bệnh nhân đang trong phòng và cảnh báo nếu một ca khám kéo dài từ 60 phút. Task này chỉ hiển thị và cảnh báo; không cho lễ tân tự đổi trạng thái bác sĩ, không tự hủy/dời lịch.</w:t>
       </w:r>
     </w:p>
     <w:p>

</xml_diff>

<commit_message>
feat(receptionist): surface queue overflow handling
</commit_message>
<xml_diff>
--- a/docs/Le tan/Ke hoach xu ly loi actor Le tan 2026-08-02.docx
+++ b/docs/Le tan/Ke hoach xu ly loi actor Le tan 2026-08-02.docx
@@ -1,11 +1,10 @@
 
 <file path=word/document.xml><?xml version="1.0" encoding="utf-8"?>
-<w:document xmlns:wpc="http://schemas.microsoft.com/office/word/2010/wordprocessingCanvas" xmlns:mc="http://schemas.openxmlformats.org/markup-compatibility/2006" xmlns:o="urn:schemas-microsoft-com:office:office" xmlns:r="http://schemas.openxmlformats.org/officeDocument/2006/relationships" xmlns:m="http://schemas.openxmlformats.org/officeDocument/2006/math" xmlns:v="urn:schemas-microsoft-com:vml" xmlns:wp14="http://schemas.microsoft.com/office/word/2010/wordprocessingDrawing" xmlns:wp="http://schemas.openxmlformats.org/drawingml/2006/wordprocessingDrawing" xmlns:w10="urn:schemas-microsoft-com:office:word" xmlns:w="http://schemas.openxmlformats.org/wordprocessingml/2006/main" xmlns:w14="http://schemas.microsoft.com/office/word/2010/wordml" xmlns:w15="http://schemas.microsoft.com/office/word/2012/wordml" xmlns:wpg="http://schemas.microsoft.com/office/word/2010/wordprocessingGroup" xmlns:wpi="http://schemas.microsoft.com/office/word/2010/wordprocessingInk" xmlns:wne="http://schemas.microsoft.com/office/word/2006/wordml" xmlns:wps="http://schemas.microsoft.com/office/word/2010/wordprocessingShape" xmlns:cx="http://schemas.microsoft.com/office/drawing/2014/chartex" xmlns:cx1="http://schemas.microsoft.com/office/drawing/2015/9/8/chartex" xmlns:cx2="http://schemas.microsoft.com/office/drawing/2015/10/21/chartex" xmlns:cx3="http://schemas.microsoft.com/office/drawing/2016/5/9/chartex" xmlns:cx4="http://schemas.microsoft.com/office/drawing/2016/5/10/chartex" xmlns:cx5="http://schemas.microsoft.com/office/drawing/2016/5/11/chartex" xmlns:cx6="http://schemas.microsoft.com/office/drawing/2016/5/12/chartex" xmlns:cx7="http://schemas.microsoft.com/office/drawing/2016/5/13/chartex" xmlns:cx8="http://schemas.microsoft.com/office/drawing/2016/5/14/chartex" xmlns:aink="http://schemas.microsoft.com/office/drawing/2016/ink" xmlns:am3d="http://schemas.microsoft.com/office/drawing/2017/model3d" xmlns:w16cex="http://schemas.microsoft.com/office/word/2018/wordml/cex" xmlns:w16cid="http://schemas.microsoft.com/office/word/2016/wordml/cid" xmlns:w16="http://schemas.microsoft.com/office/word/2018/wordml" xmlns:w16sdtdh="http://schemas.microsoft.com/office/word/2020/wordml/sdtdatahash" xmlns:w16se="http://schemas.microsoft.com/office/word/2015/wordml/symex" mc:Ignorable="w14 w15 wp14">
+<w:document xmlns:w="http://schemas.openxmlformats.org/wordprocessingml/2006/main" xmlns:r="http://schemas.openxmlformats.org/officeDocument/2006/relationships">
   <w:body>
     <w:p>
       <w:pPr>
         <w:pStyle w:val="Title"/>
-        <w:jc w:val="center"/>
       </w:pPr>
       <w:r>
         <w:t xml:space="preserve">Kế hoạch xử lý lỗi nghiệp vụ actor Lễ tân</w:t>
@@ -66,62 +65,50 @@
     </w:p>
     <w:p/>
     <w:p>
-      <w:r>
-        <w:rPr>
-          <w:rFonts w:ascii="Consolas" w:cs="Consolas" w:eastAsia="Consolas" w:hAnsi="Consolas"/>
-          <w:sz w:val="20"/>
-          <w:szCs w:val="20"/>
-        </w:rPr>
+      <w:pPr>
+        <w:pStyle w:val="Code"/>
+      </w:pPr>
+      <w:r>
         <w:t xml:space="preserve">LichHen       = cam kết đặt chỗ trước khi đến</w:t>
       </w:r>
     </w:p>
     <w:p>
-      <w:r>
-        <w:rPr>
-          <w:rFonts w:ascii="Consolas" w:cs="Consolas" w:eastAsia="Consolas" w:hAnsi="Consolas"/>
-          <w:sz w:val="20"/>
-          <w:szCs w:val="20"/>
-        </w:rPr>
+      <w:pPr>
+        <w:pStyle w:val="Code"/>
+      </w:pPr>
+      <w:r>
         <w:t xml:space="preserve">HangDoi       = lượt khám thực tế sau check-in</w:t>
       </w:r>
     </w:p>
     <w:p>
-      <w:r>
-        <w:rPr>
-          <w:rFonts w:ascii="Consolas" w:cs="Consolas" w:eastAsia="Consolas" w:hAnsi="Consolas"/>
-          <w:sz w:val="20"/>
-          <w:szCs w:val="20"/>
-        </w:rPr>
+      <w:pPr>
+        <w:pStyle w:val="Code"/>
+      </w:pPr>
+      <w:r>
         <w:t xml:space="preserve">LichLamViec   = nguồn slot và năng lực phục vụ của bác sĩ</w:t>
       </w:r>
     </w:p>
     <w:p>
-      <w:r>
-        <w:rPr>
-          <w:rFonts w:ascii="Consolas" w:cs="Consolas" w:eastAsia="Consolas" w:hAnsi="Consolas"/>
-          <w:sz w:val="20"/>
-          <w:szCs w:val="20"/>
-        </w:rPr>
+      <w:pPr>
+        <w:pStyle w:val="Code"/>
+      </w:pPr>
+      <w:r>
         <w:t xml:space="preserve">LichSuLichHen = lịch sử thay đổi của một lịch hẹn</w:t>
       </w:r>
     </w:p>
     <w:p>
-      <w:r>
-        <w:rPr>
-          <w:rFonts w:ascii="Consolas" w:cs="Consolas" w:eastAsia="Consolas" w:hAnsi="Consolas"/>
-          <w:sz w:val="20"/>
-          <w:szCs w:val="20"/>
-        </w:rPr>
+      <w:pPr>
+        <w:pStyle w:val="Code"/>
+      </w:pPr>
+      <w:r>
         <w:t xml:space="preserve">NhatKyThaoTac = audit cho thao tác sửa dữ liệu/hồ sơ</w:t>
       </w:r>
     </w:p>
     <w:p>
-      <w:r>
-        <w:rPr>
-          <w:rFonts w:ascii="Consolas" w:cs="Consolas" w:eastAsia="Consolas" w:hAnsi="Consolas"/>
-          <w:sz w:val="20"/>
-          <w:szCs w:val="20"/>
-        </w:rPr>
+      <w:pPr>
+        <w:pStyle w:val="Code"/>
+      </w:pPr>
+      <w:r>
         <w:t xml:space="preserve">ThongBao      = thông báo trong hệ thống và trạng thái gửi</w:t>
       </w:r>
     </w:p>
@@ -170,71 +157,36 @@
     <w:p/>
     <w:p>
       <w:r>
-        <w:rPr>
-          <w:rFonts w:ascii="Consolas" w:cs="Consolas" w:eastAsia="Consolas" w:hAnsi="Consolas"/>
-          <w:sz w:val="18"/>
-          <w:szCs w:val="18"/>
-        </w:rPr>
         <w:t xml:space="preserve">| Nhóm cần đọc | Cần làm rõ |</w:t>
       </w:r>
     </w:p>
     <w:p>
       <w:r>
-        <w:rPr>
-          <w:rFonts w:ascii="Consolas" w:cs="Consolas" w:eastAsia="Consolas" w:hAnsi="Consolas"/>
-          <w:sz w:val="18"/>
-          <w:szCs w:val="18"/>
-        </w:rPr>
         <w:t xml:space="preserve">|---|---|</w:t>
       </w:r>
     </w:p>
     <w:p>
       <w:r>
-        <w:rPr>
-          <w:rFonts w:ascii="Consolas" w:cs="Consolas" w:eastAsia="Consolas" w:hAnsi="Consolas"/>
-          <w:sz w:val="18"/>
-          <w:szCs w:val="18"/>
-        </w:rPr>
         <w:t xml:space="preserve">| Model dữ liệu | LichHen, HangDoi, LichLamViec, LichSuLichHen, hồ sơ bệnh nhân, bệnh án, thông báo |</w:t>
       </w:r>
     </w:p>
     <w:p>
       <w:r>
-        <w:rPr>
-          <w:rFonts w:ascii="Consolas" w:cs="Consolas" w:eastAsia="Consolas" w:hAnsi="Consolas"/>
-          <w:sz w:val="18"/>
-          <w:szCs w:val="18"/>
-        </w:rPr>
         <w:t xml:space="preserve">| API backend | API nào đang tạo lịch, dời lịch, hủy lịch, check-in, gọi vào phòng, hoàn tất khám |</w:t>
       </w:r>
     </w:p>
     <w:p>
       <w:r>
-        <w:rPr>
-          <w:rFonts w:ascii="Consolas" w:cs="Consolas" w:eastAsia="Consolas" w:hAnsi="Consolas"/>
-          <w:sz w:val="18"/>
-          <w:szCs w:val="18"/>
-        </w:rPr>
         <w:t xml:space="preserve">| Frontend lễ tân | Màn nào đang gọi API, nút nào đang cho thao tác, trạng thái nào đang ẩn/hiện |</w:t>
       </w:r>
     </w:p>
     <w:p>
       <w:r>
-        <w:rPr>
-          <w:rFonts w:ascii="Consolas" w:cs="Consolas" w:eastAsia="Consolas" w:hAnsi="Consolas"/>
-          <w:sz w:val="18"/>
-          <w:szCs w:val="18"/>
-        </w:rPr>
         <w:t xml:space="preserve">| Actor liên quan | Khách hàng, bác sĩ, admin có đang dùng chung dữ liệu hoặc API với lễ tân không |</w:t>
       </w:r>
     </w:p>
     <w:p>
       <w:r>
-        <w:rPr>
-          <w:rFonts w:ascii="Consolas" w:cs="Consolas" w:eastAsia="Consolas" w:hAnsi="Consolas"/>
-          <w:sz w:val="18"/>
-          <w:szCs w:val="18"/>
-        </w:rPr>
         <w:t xml:space="preserve">| Ràng buộc hiện tại | Có transaction chưa, có chống trùng slot chưa, có audit chưa, có gửi thông báo chưa |</w:t>
       </w:r>
     </w:p>
@@ -246,42 +198,34 @@
     </w:p>
     <w:p/>
     <w:p>
-      <w:r>
-        <w:rPr>
-          <w:rFonts w:ascii="Consolas" w:cs="Consolas" w:eastAsia="Consolas" w:hAnsi="Consolas"/>
-          <w:sz w:val="20"/>
-          <w:szCs w:val="20"/>
-        </w:rPr>
+      <w:pPr>
+        <w:pStyle w:val="Code"/>
+      </w:pPr>
+      <w:r>
         <w:t xml:space="preserve">Chức năng: hủy lịch</w:t>
       </w:r>
     </w:p>
     <w:p>
-      <w:r>
-        <w:rPr>
-          <w:rFonts w:ascii="Consolas" w:cs="Consolas" w:eastAsia="Consolas" w:hAnsi="Consolas"/>
-          <w:sz w:val="20"/>
-          <w:szCs w:val="20"/>
-        </w:rPr>
+      <w:pPr>
+        <w:pStyle w:val="Code"/>
+      </w:pPr>
+      <w:r>
         <w:t xml:space="preserve">Hiện tại: đổi LichHen.status và trả slot LichLamViec</w:t>
       </w:r>
     </w:p>
     <w:p>
-      <w:r>
-        <w:rPr>
-          <w:rFonts w:ascii="Consolas" w:cs="Consolas" w:eastAsia="Consolas" w:hAnsi="Consolas"/>
-          <w:sz w:val="20"/>
-          <w:szCs w:val="20"/>
-        </w:rPr>
+      <w:pPr>
+        <w:pStyle w:val="Code"/>
+      </w:pPr>
+      <w:r>
         <w:t xml:space="preserve">Thiếu: chưa chuẩn hóa audit lễ tân, chưa ràng buộc thông báo, chưa khóa nếu bệnh nhân đang khám</w:t>
       </w:r>
     </w:p>
     <w:p>
-      <w:r>
-        <w:rPr>
-          <w:rFonts w:ascii="Consolas" w:cs="Consolas" w:eastAsia="Consolas" w:hAnsi="Consolas"/>
-          <w:sz w:val="20"/>
-          <w:szCs w:val="20"/>
-        </w:rPr>
+      <w:pPr>
+        <w:pStyle w:val="Code"/>
+      </w:pPr>
+      <w:r>
         <w:t xml:space="preserve">Luồng bị ảnh hưởng: khách đặt lại slot, lễ tân xem lịch, bác sĩ xem hàng đợi, báo cáo lịch sử</w:t>
       </w:r>
     </w:p>
@@ -308,73 +252,59 @@
     </w:p>
     <w:p/>
     <w:p>
-      <w:r>
-        <w:rPr>
-          <w:rFonts w:ascii="Consolas" w:cs="Consolas" w:eastAsia="Consolas" w:hAnsi="Consolas"/>
-          <w:sz w:val="20"/>
-          <w:szCs w:val="20"/>
-        </w:rPr>
+      <w:pPr>
+        <w:pStyle w:val="Code"/>
+      </w:pPr>
+      <w:r>
         <w:t xml:space="preserve">Khi khách đã có lịch nhưng đến muộn,</w:t>
       </w:r>
     </w:p>
     <w:p>
-      <w:r>
-        <w:rPr>
-          <w:rFonts w:ascii="Consolas" w:cs="Consolas" w:eastAsia="Consolas" w:hAnsi="Consolas"/>
-          <w:sz w:val="20"/>
-          <w:szCs w:val="20"/>
-        </w:rPr>
+      <w:pPr>
+        <w:pStyle w:val="Code"/>
+      </w:pPr>
+      <w:r>
         <w:t xml:space="preserve">lễ tân được chọn một trong ba phương án:</w:t>
       </w:r>
     </w:p>
     <w:p>
-      <w:r>
-        <w:rPr>
-          <w:rFonts w:ascii="Consolas" w:cs="Consolas" w:eastAsia="Consolas" w:hAnsi="Consolas"/>
-          <w:sz w:val="20"/>
-          <w:szCs w:val="20"/>
-        </w:rPr>
+      <w:pPr>
+        <w:pStyle w:val="Code"/>
+      </w:pPr>
+      <w:r>
         <w:t xml:space="preserve">1. đưa khách xuống cuối lượt chờ trong cùng ca,</w:t>
       </w:r>
     </w:p>
     <w:p>
-      <w:r>
-        <w:rPr>
-          <w:rFonts w:ascii="Consolas" w:cs="Consolas" w:eastAsia="Consolas" w:hAnsi="Consolas"/>
-          <w:sz w:val="20"/>
-          <w:szCs w:val="20"/>
-        </w:rPr>
+      <w:pPr>
+        <w:pStyle w:val="Code"/>
+      </w:pPr>
+      <w:r>
         <w:t xml:space="preserve">2. chuyển sang slot trống gần nhất,</w:t>
       </w:r>
     </w:p>
     <w:p>
-      <w:r>
-        <w:rPr>
-          <w:rFonts w:ascii="Consolas" w:cs="Consolas" w:eastAsia="Consolas" w:hAnsi="Consolas"/>
-          <w:sz w:val="20"/>
-          <w:szCs w:val="20"/>
-        </w:rPr>
+      <w:pPr>
+        <w:pStyle w:val="Code"/>
+      </w:pPr>
+      <w:r>
         <w:t xml:space="preserve">3. dời sang ngày hôm sau.</w:t>
       </w:r>
     </w:p>
     <w:p/>
     <w:p>
-      <w:r>
-        <w:rPr>
-          <w:rFonts w:ascii="Consolas" w:cs="Consolas" w:eastAsia="Consolas" w:hAnsi="Consolas"/>
-          <w:sz w:val="20"/>
-          <w:szCs w:val="20"/>
-        </w:rPr>
+      <w:pPr>
+        <w:pStyle w:val="Code"/>
+      </w:pPr>
+      <w:r>
         <w:t xml:space="preserve">Mỗi phương án phải ghi lịch sử và tạo thông báo cho khách.</w:t>
       </w:r>
     </w:p>
     <w:p>
-      <w:r>
-        <w:rPr>
-          <w:rFonts w:ascii="Consolas" w:cs="Consolas" w:eastAsia="Consolas" w:hAnsi="Consolas"/>
-          <w:sz w:val="20"/>
-          <w:szCs w:val="20"/>
-        </w:rPr>
+      <w:pPr>
+        <w:pStyle w:val="Code"/>
+      </w:pPr>
+      <w:r>
         <w:t xml:space="preserve">Nếu khách đã vào phòng khám thì không được dời/hủy lịch nữa.</w:t>
       </w:r>
     </w:p>
@@ -407,62 +337,50 @@
     </w:p>
     <w:p/>
     <w:p>
-      <w:r>
-        <w:rPr>
-          <w:rFonts w:ascii="Consolas" w:cs="Consolas" w:eastAsia="Consolas" w:hAnsi="Consolas"/>
-          <w:sz w:val="20"/>
-          <w:szCs w:val="20"/>
-        </w:rPr>
+      <w:pPr>
+        <w:pStyle w:val="Code"/>
+      </w:pPr>
+      <w:r>
         <w:t xml:space="preserve">Lễ tân thao tác</w:t>
       </w:r>
     </w:p>
     <w:p>
-      <w:r>
-        <w:rPr>
-          <w:rFonts w:ascii="Consolas" w:cs="Consolas" w:eastAsia="Consolas" w:hAnsi="Consolas"/>
-          <w:sz w:val="20"/>
-          <w:szCs w:val="20"/>
-        </w:rPr>
+      <w:pPr>
+        <w:pStyle w:val="Code"/>
+      </w:pPr>
+      <w:r>
         <w:t xml:space="preserve">  -&gt; backend kiểm tra trạng thái lịch/hàng đợi/slot</w:t>
       </w:r>
     </w:p>
     <w:p>
-      <w:r>
-        <w:rPr>
-          <w:rFonts w:ascii="Consolas" w:cs="Consolas" w:eastAsia="Consolas" w:hAnsi="Consolas"/>
-          <w:sz w:val="20"/>
-          <w:szCs w:val="20"/>
-        </w:rPr>
+      <w:pPr>
+        <w:pStyle w:val="Code"/>
+      </w:pPr>
+      <w:r>
         <w:t xml:space="preserve">  -&gt; backend ghi thay đổi trong transaction</w:t>
       </w:r>
     </w:p>
     <w:p>
-      <w:r>
-        <w:rPr>
-          <w:rFonts w:ascii="Consolas" w:cs="Consolas" w:eastAsia="Consolas" w:hAnsi="Consolas"/>
-          <w:sz w:val="20"/>
-          <w:szCs w:val="20"/>
-        </w:rPr>
+      <w:pPr>
+        <w:pStyle w:val="Code"/>
+      </w:pPr>
+      <w:r>
         <w:t xml:space="preserve">  -&gt; backend ghi lịch sử/audit</w:t>
       </w:r>
     </w:p>
     <w:p>
-      <w:r>
-        <w:rPr>
-          <w:rFonts w:ascii="Consolas" w:cs="Consolas" w:eastAsia="Consolas" w:hAnsi="Consolas"/>
-          <w:sz w:val="20"/>
-          <w:szCs w:val="20"/>
-        </w:rPr>
+      <w:pPr>
+        <w:pStyle w:val="Code"/>
+      </w:pPr>
+      <w:r>
         <w:t xml:space="preserve">  -&gt; backend tạo thông báo hoặc việc cần gọi thủ công</w:t>
       </w:r>
     </w:p>
     <w:p>
-      <w:r>
-        <w:rPr>
-          <w:rFonts w:ascii="Consolas" w:cs="Consolas" w:eastAsia="Consolas" w:hAnsi="Consolas"/>
-          <w:sz w:val="20"/>
-          <w:szCs w:val="20"/>
-        </w:rPr>
+      <w:pPr>
+        <w:pStyle w:val="Code"/>
+      </w:pPr>
+      <w:r>
         <w:t xml:space="preserve">  -&gt; khách hàng/bác sĩ/admin nhìn thấy trạng thái mới</w:t>
       </w:r>
     </w:p>
@@ -521,101 +439,51 @@
     <w:p/>
     <w:p>
       <w:r>
-        <w:rPr>
-          <w:rFonts w:ascii="Consolas" w:cs="Consolas" w:eastAsia="Consolas" w:hAnsi="Consolas"/>
-          <w:sz w:val="18"/>
-          <w:szCs w:val="18"/>
-        </w:rPr>
         <w:t xml:space="preserve">| Chức năng định sửa | Có thể xung đột với | Rủi ro nếu không kiểm tra |</w:t>
       </w:r>
     </w:p>
     <w:p>
       <w:r>
-        <w:rPr>
-          <w:rFonts w:ascii="Consolas" w:cs="Consolas" w:eastAsia="Consolas" w:hAnsi="Consolas"/>
-          <w:sz w:val="18"/>
-          <w:szCs w:val="18"/>
-        </w:rPr>
         <w:t xml:space="preserve">|---|---|---|</w:t>
       </w:r>
     </w:p>
     <w:p>
       <w:r>
-        <w:rPr>
-          <w:rFonts w:ascii="Consolas" w:cs="Consolas" w:eastAsia="Consolas" w:hAnsi="Consolas"/>
-          <w:sz w:val="18"/>
-          <w:szCs w:val="18"/>
-        </w:rPr>
         <w:t xml:space="preserve">| Dời lịch | đặt lịch online, slot bác sĩ, thông báo, audit | trùng slot, khách không biết lịch mới, mất lịch sử |</w:t>
       </w:r>
     </w:p>
     <w:p>
       <w:r>
-        <w:rPr>
-          <w:rFonts w:ascii="Consolas" w:cs="Consolas" w:eastAsia="Consolas" w:hAnsi="Consolas"/>
-          <w:sz w:val="18"/>
-          <w:szCs w:val="18"/>
-        </w:rPr>
         <w:t xml:space="preserve">| Hủy lịch | đặt lịch online, hàng đợi, hóa đơn nếu đã khám | người khác không đặt được slot, hoặc hủy nhầm lượt đang khám |</w:t>
       </w:r>
     </w:p>
     <w:p>
       <w:r>
-        <w:rPr>
-          <w:rFonts w:ascii="Consolas" w:cs="Consolas" w:eastAsia="Consolas" w:hAnsi="Consolas"/>
-          <w:sz w:val="18"/>
-          <w:szCs w:val="18"/>
-        </w:rPr>
         <w:t xml:space="preserve">| Check-in | hàng đợi, số thứ tự, bác sĩ gọi bệnh nhân | trùng số thứ tự, tạo hai lượt khám cho một lịch |</w:t>
       </w:r>
     </w:p>
     <w:p>
       <w:r>
-        <w:rPr>
-          <w:rFonts w:ascii="Consolas" w:cs="Consolas" w:eastAsia="Consolas" w:hAnsi="Consolas"/>
-          <w:sz w:val="18"/>
-          <w:szCs w:val="18"/>
-        </w:rPr>
         <w:t xml:space="preserve">| Khách đến muộn | thứ tự hàng đợi, slot trong ngày, notification | đẩy sai người đang chờ, khách bị đổi giờ không rõ lý do |</w:t>
       </w:r>
     </w:p>
     <w:p>
       <w:r>
-        <w:rPr>
-          <w:rFonts w:ascii="Consolas" w:cs="Consolas" w:eastAsia="Consolas" w:hAnsi="Consolas"/>
-          <w:sz w:val="18"/>
-          <w:szCs w:val="18"/>
-        </w:rPr>
         <w:t xml:space="preserve">| Bác sĩ khám lâu | dashboard bác sĩ, hàng đợi, lịch chưa check-in | tự động đổi giờ hàng loạt, làm lệch cam kết đặt lịch |</w:t>
       </w:r>
     </w:p>
     <w:p>
       <w:r>
-        <w:rPr>
-          <w:rFonts w:ascii="Consolas" w:cs="Consolas" w:eastAsia="Consolas" w:hAnsi="Consolas"/>
-          <w:sz w:val="18"/>
-          <w:szCs w:val="18"/>
-        </w:rPr>
         <w:t xml:space="preserve">| Chuyển bác sĩ | lịch làm việc bác sĩ mới, chuyên khoa, thông báo | chuyển sang bác sĩ không phù hợp hoặc không còn slot |</w:t>
       </w:r>
     </w:p>
     <w:p>
       <w:r>
-        <w:rPr>
-          <w:rFonts w:ascii="Consolas" w:cs="Consolas" w:eastAsia="Consolas" w:hAnsi="Consolas"/>
-          <w:sz w:val="18"/>
-          <w:szCs w:val="18"/>
-        </w:rPr>
         <w:t xml:space="preserve">| Sửa thông tin bệnh nhân | hồ sơ khám, hóa đơn, bệnh án, audit | mất tính truy vết dữ liệu đã dùng trong khám |</w:t>
       </w:r>
     </w:p>
     <w:p>
       <w:r>
-        <w:rPr>
-          <w:rFonts w:ascii="Consolas" w:cs="Consolas" w:eastAsia="Consolas" w:hAnsi="Consolas"/>
-          <w:sz w:val="18"/>
-          <w:szCs w:val="18"/>
-        </w:rPr>
         <w:t xml:space="preserve">| Sửa bệnh án | quyền bác sĩ/admin, pháp lý nghiệp vụ, lịch sử revision | lễ tân sửa dữ liệu chuyên môn không kiểm soát |</w:t>
       </w:r>
     </w:p>
@@ -643,101 +511,51 @@
     <w:p/>
     <w:p>
       <w:r>
-        <w:rPr>
-          <w:rFonts w:ascii="Consolas" w:cs="Consolas" w:eastAsia="Consolas" w:hAnsi="Consolas"/>
-          <w:sz w:val="18"/>
-          <w:szCs w:val="18"/>
-        </w:rPr>
         <w:t xml:space="preserve">| Contract cần chốt | Câu trả lời cần có |</w:t>
       </w:r>
     </w:p>
     <w:p>
       <w:r>
-        <w:rPr>
-          <w:rFonts w:ascii="Consolas" w:cs="Consolas" w:eastAsia="Consolas" w:hAnsi="Consolas"/>
-          <w:sz w:val="18"/>
-          <w:szCs w:val="18"/>
-        </w:rPr>
         <w:t xml:space="preserve">|---|---|</w:t>
       </w:r>
     </w:p>
     <w:p>
       <w:r>
-        <w:rPr>
-          <w:rFonts w:ascii="Consolas" w:cs="Consolas" w:eastAsia="Consolas" w:hAnsi="Consolas"/>
-          <w:sz w:val="18"/>
-          <w:szCs w:val="18"/>
-        </w:rPr>
         <w:t xml:space="preserve">| Trạng thái đầu vào | Lịch/hàng đợi/slot đang ở trạng thái nào thì được thao tác |</w:t>
       </w:r>
     </w:p>
     <w:p>
       <w:r>
-        <w:rPr>
-          <w:rFonts w:ascii="Consolas" w:cs="Consolas" w:eastAsia="Consolas" w:hAnsi="Consolas"/>
-          <w:sz w:val="18"/>
-          <w:szCs w:val="18"/>
-        </w:rPr>
         <w:t xml:space="preserve">| Trạng thái đầu ra | Sau thao tác, LichHen, HangDoi, LichLamViec đổi ra sao |</w:t>
       </w:r>
     </w:p>
     <w:p>
       <w:r>
-        <w:rPr>
-          <w:rFonts w:ascii="Consolas" w:cs="Consolas" w:eastAsia="Consolas" w:hAnsi="Consolas"/>
-          <w:sz w:val="18"/>
-          <w:szCs w:val="18"/>
-        </w:rPr>
         <w:t xml:space="preserve">| Quyền actor | Lễ tân/admin/bác sĩ/khách ai được làm, ai chỉ được xem |</w:t>
       </w:r>
     </w:p>
     <w:p>
       <w:r>
-        <w:rPr>
-          <w:rFonts w:ascii="Consolas" w:cs="Consolas" w:eastAsia="Consolas" w:hAnsi="Consolas"/>
-          <w:sz w:val="18"/>
-          <w:szCs w:val="18"/>
-        </w:rPr>
         <w:t xml:space="preserve">| Audit | Ghi bảng nào, ghi trước/sau gì, ghi lý do gì |</w:t>
       </w:r>
     </w:p>
     <w:p>
       <w:r>
-        <w:rPr>
-          <w:rFonts w:ascii="Consolas" w:cs="Consolas" w:eastAsia="Consolas" w:hAnsi="Consolas"/>
-          <w:sz w:val="18"/>
-          <w:szCs w:val="18"/>
-        </w:rPr>
         <w:t xml:space="preserve">| Thông báo | Có gửi cho khách không, gửi nội dung gì, gửi lỗi thì xử lý thế nào |</w:t>
       </w:r>
     </w:p>
     <w:p>
       <w:r>
-        <w:rPr>
-          <w:rFonts w:ascii="Consolas" w:cs="Consolas" w:eastAsia="Consolas" w:hAnsi="Consolas"/>
-          <w:sz w:val="18"/>
-          <w:szCs w:val="18"/>
-        </w:rPr>
         <w:t xml:space="preserve">| Transaction | Các thay đổi nào phải commit cùng nhau |</w:t>
       </w:r>
     </w:p>
     <w:p>
       <w:r>
-        <w:rPr>
-          <w:rFonts w:ascii="Consolas" w:cs="Consolas" w:eastAsia="Consolas" w:hAnsi="Consolas"/>
-          <w:sz w:val="18"/>
-          <w:szCs w:val="18"/>
-        </w:rPr>
         <w:t xml:space="preserve">| API/UI | API trả gì cho frontend, nút nào bật/tắt, lỗi nào hiển thị |</w:t>
       </w:r>
     </w:p>
     <w:p>
       <w:r>
-        <w:rPr>
-          <w:rFonts w:ascii="Consolas" w:cs="Consolas" w:eastAsia="Consolas" w:hAnsi="Consolas"/>
-          <w:sz w:val="18"/>
-          <w:szCs w:val="18"/>
-        </w:rPr>
         <w:t xml:space="preserve">| Test liên chức năng | Cần test thêm luồng nào ngoài màn lễ tân |</w:t>
       </w:r>
     </w:p>
@@ -764,82 +582,66 @@
     </w:p>
     <w:p/>
     <w:p>
-      <w:r>
-        <w:rPr>
-          <w:rFonts w:ascii="Consolas" w:cs="Consolas" w:eastAsia="Consolas" w:hAnsi="Consolas"/>
-          <w:sz w:val="20"/>
-          <w:szCs w:val="20"/>
-        </w:rPr>
+      <w:pPr>
+        <w:pStyle w:val="Code"/>
+      </w:pPr>
+      <w:r>
         <w:t xml:space="preserve">1. Đọc code hiện tại của đúng luồng</w:t>
       </w:r>
     </w:p>
     <w:p>
-      <w:r>
-        <w:rPr>
-          <w:rFonts w:ascii="Consolas" w:cs="Consolas" w:eastAsia="Consolas" w:hAnsi="Consolas"/>
-          <w:sz w:val="20"/>
-          <w:szCs w:val="20"/>
-        </w:rPr>
+      <w:pPr>
+        <w:pStyle w:val="Code"/>
+      </w:pPr>
+      <w:r>
         <w:t xml:space="preserve">2. Ghi lại hiện trạng và điểm thiếu</w:t>
       </w:r>
     </w:p>
     <w:p>
-      <w:r>
-        <w:rPr>
-          <w:rFonts w:ascii="Consolas" w:cs="Consolas" w:eastAsia="Consolas" w:hAnsi="Consolas"/>
-          <w:sz w:val="20"/>
-          <w:szCs w:val="20"/>
-        </w:rPr>
+      <w:pPr>
+        <w:pStyle w:val="Code"/>
+      </w:pPr>
+      <w:r>
         <w:t xml:space="preserve">3. So sánh với yêu cầu mong muốn</w:t>
       </w:r>
     </w:p>
     <w:p>
-      <w:r>
-        <w:rPr>
-          <w:rFonts w:ascii="Consolas" w:cs="Consolas" w:eastAsia="Consolas" w:hAnsi="Consolas"/>
-          <w:sz w:val="20"/>
-          <w:szCs w:val="20"/>
-        </w:rPr>
+      <w:pPr>
+        <w:pStyle w:val="Code"/>
+      </w:pPr>
+      <w:r>
         <w:t xml:space="preserve">4. Liệt kê chức năng liên quan có thể xung đột</w:t>
       </w:r>
     </w:p>
     <w:p>
-      <w:r>
-        <w:rPr>
-          <w:rFonts w:ascii="Consolas" w:cs="Consolas" w:eastAsia="Consolas" w:hAnsi="Consolas"/>
-          <w:sz w:val="20"/>
-          <w:szCs w:val="20"/>
-        </w:rPr>
+      <w:pPr>
+        <w:pStyle w:val="Code"/>
+      </w:pPr>
+      <w:r>
         <w:t xml:space="preserve">5. Chọn phương án sửa tối giản</w:t>
       </w:r>
     </w:p>
     <w:p>
-      <w:r>
-        <w:rPr>
-          <w:rFonts w:ascii="Consolas" w:cs="Consolas" w:eastAsia="Consolas" w:hAnsi="Consolas"/>
-          <w:sz w:val="20"/>
-          <w:szCs w:val="20"/>
-        </w:rPr>
+      <w:pPr>
+        <w:pStyle w:val="Code"/>
+      </w:pPr>
+      <w:r>
         <w:t xml:space="preserve">6. Chốt dữ liệu/API/UI/audit/notification/test</w:t>
       </w:r>
     </w:p>
     <w:p>
-      <w:r>
-        <w:rPr>
-          <w:rFonts w:ascii="Consolas" w:cs="Consolas" w:eastAsia="Consolas" w:hAnsi="Consolas"/>
-          <w:sz w:val="20"/>
-          <w:szCs w:val="20"/>
-        </w:rPr>
+      <w:pPr>
+        <w:pStyle w:val="Code"/>
+      </w:pPr>
+      <w:r>
         <w:t xml:space="preserve">7. Sau đó mới code</w:t>
       </w:r>
     </w:p>
     <w:p>
-      <w:r>
-        <w:rPr>
-          <w:rFonts w:ascii="Consolas" w:cs="Consolas" w:eastAsia="Consolas" w:hAnsi="Consolas"/>
-          <w:sz w:val="20"/>
-          <w:szCs w:val="20"/>
-        </w:rPr>
+      <w:pPr>
+        <w:pStyle w:val="Code"/>
+      </w:pPr>
+      <w:r>
         <w:t xml:space="preserve">8. Chạy test hoặc kiểm thử tay theo kịch bản liên actor</w:t>
       </w:r>
     </w:p>
@@ -870,51 +672,26 @@
     <w:p/>
     <w:p>
       <w:r>
-        <w:rPr>
-          <w:rFonts w:ascii="Consolas" w:cs="Consolas" w:eastAsia="Consolas" w:hAnsi="Consolas"/>
-          <w:sz w:val="18"/>
-          <w:szCs w:val="18"/>
-        </w:rPr>
         <w:t xml:space="preserve">| Lớp | Dữ liệu | Ý nghĩa | Không dùng để |</w:t>
       </w:r>
     </w:p>
     <w:p>
       <w:r>
-        <w:rPr>
-          <w:rFonts w:ascii="Consolas" w:cs="Consolas" w:eastAsia="Consolas" w:hAnsi="Consolas"/>
-          <w:sz w:val="18"/>
-          <w:szCs w:val="18"/>
-        </w:rPr>
         <w:t xml:space="preserve">|---|---|---|---|</w:t>
       </w:r>
     </w:p>
     <w:p>
       <w:r>
-        <w:rPr>
-          <w:rFonts w:ascii="Consolas" w:cs="Consolas" w:eastAsia="Consolas" w:hAnsi="Consolas"/>
-          <w:sz w:val="18"/>
-          <w:szCs w:val="18"/>
-        </w:rPr>
         <w:t xml:space="preserve">| Lịch hẹn | LichHen.status | Chưa xác nhận, đã xác nhận, đã check-in, đang khám, hoàn tất, hủy, vắng mặt | Suy ra vị trí xếp hàng |</w:t>
       </w:r>
     </w:p>
     <w:p>
       <w:r>
-        <w:rPr>
-          <w:rFonts w:ascii="Consolas" w:cs="Consolas" w:eastAsia="Consolas" w:hAnsi="Consolas"/>
-          <w:sz w:val="18"/>
-          <w:szCs w:val="18"/>
-        </w:rPr>
         <w:t xml:space="preserve">| Hàng đợi | HangDoi.trang_thai | Đang chờ, đã gọi, trong phòng, chờ dịch vụ, bỏ qua, hoàn thành | Giữ chỗ đặt lịch cho người khác |</w:t>
       </w:r>
     </w:p>
     <w:p>
       <w:r>
-        <w:rPr>
-          <w:rFonts w:ascii="Consolas" w:cs="Consolas" w:eastAsia="Consolas" w:hAnsi="Consolas"/>
-          <w:sz w:val="18"/>
-          <w:szCs w:val="18"/>
-        </w:rPr>
         <w:t xml:space="preserve">| Bác sĩ/ca làm việc | trạng thái tác nghiệp của bác sĩ và LichLamViec | Có thể tiếp nhận, tạm gián đoạn, quá tải, nghỉ đột xuất | Thay thế trạng thái của từng lịch hẹn |</w:t>
       </w:r>
     </w:p>
@@ -936,61 +713,31 @@
     <w:p/>
     <w:p>
       <w:r>
-        <w:rPr>
-          <w:rFonts w:ascii="Consolas" w:cs="Consolas" w:eastAsia="Consolas" w:hAnsi="Consolas"/>
-          <w:sz w:val="18"/>
-          <w:szCs w:val="18"/>
-        </w:rPr>
         <w:t xml:space="preserve">| Actor | Được làm | Không được làm |</w:t>
       </w:r>
     </w:p>
     <w:p>
       <w:r>
-        <w:rPr>
-          <w:rFonts w:ascii="Consolas" w:cs="Consolas" w:eastAsia="Consolas" w:hAnsi="Consolas"/>
-          <w:sz w:val="18"/>
-          <w:szCs w:val="18"/>
-        </w:rPr>
         <w:t xml:space="preserve">|---|---|---|</w:t>
       </w:r>
     </w:p>
     <w:p>
       <w:r>
-        <w:rPr>
-          <w:rFonts w:ascii="Consolas" w:cs="Consolas" w:eastAsia="Consolas" w:hAnsi="Consolas"/>
-          <w:sz w:val="18"/>
-          <w:szCs w:val="18"/>
-        </w:rPr>
         <w:t xml:space="preserve">| Lễ tân | check-in, tạo lượt tại quầy, dời/hủy lịch trước khi vào hàng đợi, đề xuất/chọn phương án điều phối, sửa thông tin hành chính có lý do | tự đổi kết quả khám, tự đổi chẩn đoán/đơn thuốc, sửa lịch đang trong phòng |</w:t>
       </w:r>
     </w:p>
     <w:p>
       <w:r>
-        <w:rPr>
-          <w:rFonts w:ascii="Consolas" w:cs="Consolas" w:eastAsia="Consolas" w:hAnsi="Consolas"/>
-          <w:sz w:val="18"/>
-          <w:szCs w:val="18"/>
-        </w:rPr>
         <w:t xml:space="preserve">| Bác sĩ | gọi bệnh nhân, vào phòng, hoàn tất khám, cập nhật trạng thái năng lực phục vụ | tự check-in khách, tự dời các lịch khác của khách |</w:t>
       </w:r>
     </w:p>
     <w:p>
       <w:r>
-        <w:rPr>
-          <w:rFonts w:ascii="Consolas" w:cs="Consolas" w:eastAsia="Consolas" w:hAnsi="Consolas"/>
-          <w:sz w:val="18"/>
-          <w:szCs w:val="18"/>
-        </w:rPr>
         <w:t xml:space="preserve">| Admin | duyệt trường hợp ngoại lệ, điều phối bác sĩ nghỉ, sửa dữ liệu theo quyền cao hơn | xóa lịch sử/audit, ghi đè dữ liệu không lý do |</w:t>
       </w:r>
     </w:p>
     <w:p>
       <w:r>
-        <w:rPr>
-          <w:rFonts w:ascii="Consolas" w:cs="Consolas" w:eastAsia="Consolas" w:hAnsi="Consolas"/>
-          <w:sz w:val="18"/>
-          <w:szCs w:val="18"/>
-        </w:rPr>
         <w:t xml:space="preserve">| Khách hàng | nhận thông báo, chọn phương án dời khi được mời, tự hủy/dời trong điều kiện cho phép | tự chuyển bác sĩ hoặc sửa lịch đã vào khám |</w:t>
       </w:r>
     </w:p>
@@ -1005,49 +752,21 @@
     </w:p>
     <w:p/>
     <w:p>
-      <w:pPr>
-        <w:pStyle w:val="ListParagraph"/>
-        <w:numPr>
-          <w:ilvl w:val="0"/>
-          <w:numId w:val="1"/>
-        </w:numPr>
-      </w:pPr>
       <w:r>
         <w:t xml:space="preserve">? Không tự động đổi bác sĩ hoặc đổi ngày cho khách. Hệ thống chỉ gợi ý và giữ tạm phương án; lễ tân/khách xác nhận theo quy tắc từng tình huống.</w:t>
       </w:r>
     </w:p>
     <w:p>
-      <w:pPr>
-        <w:pStyle w:val="ListParagraph"/>
-        <w:numPr>
-          <w:ilvl w:val="0"/>
-          <w:numId w:val="1"/>
-        </w:numPr>
-      </w:pPr>
       <w:r>
         <w:t xml:space="preserve">? Không tự động đẩy tất cả gio_kham khi một ca khám kéo dài. Lịch đã đặt vẫn giữ cam kết; hệ thống cập nhật ước tính chờ và điều phối trên hàng đợi.</w:t>
       </w:r>
     </w:p>
     <w:p>
-      <w:pPr>
-        <w:pStyle w:val="ListParagraph"/>
-        <w:numPr>
-          <w:ilvl w:val="0"/>
-          <w:numId w:val="1"/>
-        </w:numPr>
-      </w:pPr>
       <w:r>
         <w:t xml:space="preserve">? Mỗi thao tác thay đổi phải có một lý do chuẩn hóa và ghi một audit; không cần tạo thêm nhiều màn hình nhật ký riêng.</w:t>
       </w:r>
     </w:p>
     <w:p>
-      <w:pPr>
-        <w:pStyle w:val="ListParagraph"/>
-        <w:numPr>
-          <w:ilvl w:val="0"/>
-          <w:numId w:val="1"/>
-        </w:numPr>
-      </w:pPr>
       <w:r>
         <w:t xml:space="preserve">? Thông báo là phần của giao dịch điều phối. Không trả kết quả “đã dời” khi chưa tạo bản ghi thông báo hoặc bản ghi “cần gọi thủ công”.</w:t>
       </w:r>
@@ -1096,52 +815,42 @@
     </w:p>
     <w:p/>
     <w:p>
-      <w:r>
-        <w:rPr>
-          <w:rFonts w:ascii="Consolas" w:cs="Consolas" w:eastAsia="Consolas" w:hAnsi="Consolas"/>
-          <w:sz w:val="20"/>
-          <w:szCs w:val="20"/>
-        </w:rPr>
+      <w:pPr>
+        <w:pStyle w:val="Code"/>
+      </w:pPr>
+      <w:r>
         <w:t xml:space="preserve">Lễ tân mở lịch</w:t>
       </w:r>
     </w:p>
     <w:p>
-      <w:r>
-        <w:rPr>
-          <w:rFonts w:ascii="Consolas" w:cs="Consolas" w:eastAsia="Consolas" w:hAnsi="Consolas"/>
-          <w:sz w:val="20"/>
-          <w:szCs w:val="20"/>
-        </w:rPr>
+      <w:pPr>
+        <w:pStyle w:val="Code"/>
+      </w:pPr>
+      <w:r>
         <w:t xml:space="preserve">  -&gt; backend đọc LichHen + HangDoi liên quan</w:t>
       </w:r>
     </w:p>
     <w:p>
-      <w:r>
-        <w:rPr>
-          <w:rFonts w:ascii="Consolas" w:cs="Consolas" w:eastAsia="Consolas" w:hAnsi="Consolas"/>
-          <w:sz w:val="20"/>
-          <w:szCs w:val="20"/>
-        </w:rPr>
+      <w:pPr>
+        <w:pStyle w:val="Code"/>
+      </w:pPr>
+      <w:r>
         <w:t xml:space="preserve">  -&gt; trả action được phép: check-in / dời / hủy / chỉ xem</w:t>
       </w:r>
     </w:p>
     <w:p>
-      <w:r>
-        <w:rPr>
-          <w:rFonts w:ascii="Consolas" w:cs="Consolas" w:eastAsia="Consolas" w:hAnsi="Consolas"/>
-          <w:sz w:val="20"/>
-          <w:szCs w:val="20"/>
-        </w:rPr>
+      <w:pPr>
+        <w:pStyle w:val="Code"/>
+      </w:pPr>
+      <w:r>
         <w:t xml:space="preserve">  -&gt; giao diện chỉ hiện action đó</w:t>
       </w:r>
     </w:p>
     <w:p>
-      <w:r>
-        <w:rPr>
-          <w:rFonts w:ascii="Consolas" w:cs="Consolas" w:eastAsia="Consolas" w:hAnsi="Consolas"/>
-          <w:sz w:val="20"/>
-          <w:szCs w:val="20"/>
-        </w:rPr>
+      <w:pPr>
+        <w:pStyle w:val="Code"/>
+      </w:pPr>
+      <w:r>
         <w:t xml:space="preserve">  -&gt; backend vẫn kiểm tra lại trước khi ghi</w:t>
       </w:r>
     </w:p>
@@ -1159,37 +868,16 @@
     </w:p>
     <w:p/>
     <w:p>
-      <w:pPr>
-        <w:pStyle w:val="ListParagraph"/>
-        <w:numPr>
-          <w:ilvl w:val="0"/>
-          <w:numId w:val="1"/>
-        </w:numPr>
-      </w:pPr>
       <w:r>
         <w:t xml:space="preserve">? Dùng lại backend/src/utils/appointmentStatus.js; không đổi tên enum hàng loạt.</w:t>
       </w:r>
     </w:p>
     <w:p>
-      <w:pPr>
-        <w:pStyle w:val="ListParagraph"/>
-        <w:numPr>
-          <w:ilvl w:val="0"/>
-          <w:numId w:val="1"/>
-        </w:numPr>
-      </w:pPr>
       <w:r>
         <w:t xml:space="preserve">? API lịch hẹn trả thêm allowed_actions và lock_reason để frontend không tự suy đoán.</w:t>
       </w:r>
     </w:p>
     <w:p>
-      <w:pPr>
-        <w:pStyle w:val="ListParagraph"/>
-        <w:numPr>
-          <w:ilvl w:val="0"/>
-          <w:numId w:val="1"/>
-        </w:numPr>
-      </w:pPr>
       <w:r>
         <w:t xml:space="preserve">? Màn lễ tân ẩn hoặc khóa nút, nhưng phải hiển thị lý do như “Bệnh nhân đang trong phòng khám”.</w:t>
       </w:r>
@@ -1202,8 +890,11 @@
     </w:p>
     <w:p/>
     <w:p>
-      <w:r>
-        <w:t xml:space="preserve">#### Phân tích workflow LT-00 trước khi code</w:t>
+      <w:pPr>
+        <w:pStyle w:val="Heading3"/>
+      </w:pPr>
+      <w:r>
+        <w:t xml:space="preserve">Phân tích workflow LT-00 trước khi code</w:t>
       </w:r>
     </w:p>
     <w:p/>
@@ -1215,111 +906,56 @@
     <w:p/>
     <w:p>
       <w:r>
-        <w:rPr>
-          <w:rFonts w:ascii="Consolas" w:cs="Consolas" w:eastAsia="Consolas" w:hAnsi="Consolas"/>
-          <w:sz w:val="18"/>
-          <w:szCs w:val="18"/>
-        </w:rPr>
         <w:t xml:space="preserve">| Thành phần | Hiện trạng đã kiểm tra | Nhận xét |</w:t>
       </w:r>
     </w:p>
     <w:p>
       <w:r>
-        <w:rPr>
-          <w:rFonts w:ascii="Consolas" w:cs="Consolas" w:eastAsia="Consolas" w:hAnsi="Consolas"/>
-          <w:sz w:val="18"/>
-          <w:szCs w:val="18"/>
-        </w:rPr>
         <w:t xml:space="preserve">|---|---|---|</w:t>
       </w:r>
     </w:p>
     <w:p>
       <w:r>
-        <w:rPr>
-          <w:rFonts w:ascii="Consolas" w:cs="Consolas" w:eastAsia="Consolas" w:hAnsi="Consolas"/>
-          <w:sz w:val="18"/>
-          <w:szCs w:val="18"/>
-        </w:rPr>
         <w:t xml:space="preserve">| LichHen.status | Model đang có pending, confirmed, checked_in, in_progress, waiting_record, waiting_doctor_confirm, completed, cancelled, no_show, skipped tại backend/src/models/LichHen.js. | Enum khá đầy đủ, không cần đổi tên hàng loạt. Vấn đề là các nơi dùng enum chưa thống nhất. |</w:t>
       </w:r>
     </w:p>
     <w:p>
       <w:r>
-        <w:rPr>
-          <w:rFonts w:ascii="Consolas" w:cs="Consolas" w:eastAsia="Consolas" w:hAnsi="Consolas"/>
-          <w:sz w:val="18"/>
-          <w:szCs w:val="18"/>
-        </w:rPr>
         <w:t xml:space="preserve">| appointmentStatus.js | Helper đang phân nhóm trạng thái, nhưng comment/list chưa khớp hoàn toàn với enum mới, đặc biệt waiting_record và skipped. | Nếu các task sau dựa vào helper thiếu trạng thái, thống kê hoặc guard sẽ lệch. |</w:t>
       </w:r>
     </w:p>
     <w:p>
       <w:r>
-        <w:rPr>
-          <w:rFonts w:ascii="Consolas" w:cs="Consolas" w:eastAsia="Consolas" w:hAnsi="Consolas"/>
-          <w:sz w:val="18"/>
-          <w:szCs w:val="18"/>
-        </w:rPr>
         <w:t xml:space="preserve">| HangDoi.trang_thai | Hàng đợi đã có dang_cho, da_goi, trong_phong, cho_dich_vu, skipped, cancelled, hoan_thanh; có unique index theo appointment_id. | Đây là nguồn đáng tin để biết bệnh nhân đã vào hàng đợi/chưa và có đang trong phòng không. |</w:t>
       </w:r>
     </w:p>
     <w:p>
       <w:r>
-        <w:rPr>
-          <w:rFonts w:ascii="Consolas" w:cs="Consolas" w:eastAsia="Consolas" w:hAnsi="Consolas"/>
-          <w:sz w:val="18"/>
-          <w:szCs w:val="18"/>
-        </w:rPr>
         <w:t xml:space="preserve">| Check-in lễ tân | markAsArrived gọi service chung checkInLichHen, service tạo HangDoi và đổi LichHen.status='checked_in'. | Luồng này đã đúng hướng, nên LT-00 không nên viết lại check-in. Chỉ cần đưa nó vào contract action chung. |</w:t>
       </w:r>
     </w:p>
     <w:p>
       <w:r>
-        <w:rPr>
-          <w:rFonts w:ascii="Consolas" w:cs="Consolas" w:eastAsia="Consolas" w:hAnsi="Consolas"/>
-          <w:sz w:val="18"/>
-          <w:szCs w:val="18"/>
-        </w:rPr>
         <w:t xml:space="preserve">| Dời lịch lễ tân | Controller tự chặn completed, cancelled, no_show, nhưng chưa dùng guard chung; history dời lịch đang ghi vai_tro='admin'. | Có thể dời nhầm các trạng thái nhạy cảm như checked_in, in_progress nếu thiếu kiểm tra hàng đợi. |</w:t>
       </w:r>
     </w:p>
     <w:p>
       <w:r>
-        <w:rPr>
-          <w:rFonts w:ascii="Consolas" w:cs="Consolas" w:eastAsia="Consolas" w:hAnsi="Consolas"/>
-          <w:sz w:val="18"/>
-          <w:szCs w:val="18"/>
-        </w:rPr>
         <w:t xml:space="preserve">| Hủy lịch lễ tân | Controller tự blacklist nhiều trạng thái và trả slot về active; chưa ghi lịch sử hủy trong LichSuLichHen, chưa kiểm trực tiếp HangDoi.trang_thai='trong_phong'. | Backend có chặn một phần, nhưng logic tản mạn và thiếu audit/thông báo. |</w:t>
       </w:r>
     </w:p>
     <w:p>
       <w:r>
-        <w:rPr>
-          <w:rFonts w:ascii="Consolas" w:cs="Consolas" w:eastAsia="Consolas" w:hAnsi="Consolas"/>
-          <w:sz w:val="18"/>
-          <w:szCs w:val="18"/>
-        </w:rPr>
         <w:t xml:space="preserve">| Lịch sử lịch hẹn | LichSuLichHen.vai_tro chỉ cho admin, doctor, user, system. | Đây là lỗi trực tiếp của actor lễ tân: không truy vết đúng vai trò. |</w:t>
       </w:r>
     </w:p>
     <w:p>
       <w:r>
-        <w:rPr>
-          <w:rFonts w:ascii="Consolas" w:cs="Consolas" w:eastAsia="Consolas" w:hAnsi="Consolas"/>
-          <w:sz w:val="18"/>
-          <w:szCs w:val="18"/>
-        </w:rPr>
         <w:t xml:space="preserve">| Route lễ tân | /api/receptionist đã có verifyToken và requireRole('receptionist','admin'). | Phân quyền route nền đã ổn, không cần mở rộng lớn. |</w:t>
       </w:r>
     </w:p>
     <w:p>
       <w:r>
-        <w:rPr>
-          <w:rFonts w:ascii="Consolas" w:cs="Consolas" w:eastAsia="Consolas" w:hAnsi="Consolas"/>
-          <w:sz w:val="18"/>
-          <w:szCs w:val="18"/>
-        </w:rPr>
         <w:t xml:space="preserve">| Frontend lễ tân | Màn Appointments.tsx tự hiện nút bằng điều kiện apt.status !== 'checked_in' &amp;&amp; apt.status !== 'cancelled'. | UI có thể hiện nút dời/hủy sai với in_progress, completed, no_show, skipped, hoặc khi HangDoi đã trong_phong. |</w:t>
       </w:r>
     </w:p>
@@ -1337,74 +973,60 @@
     </w:p>
     <w:p/>
     <w:p>
-      <w:r>
-        <w:rPr>
-          <w:rFonts w:ascii="Consolas" w:cs="Consolas" w:eastAsia="Consolas" w:hAnsi="Consolas"/>
-          <w:sz w:val="20"/>
-          <w:szCs w:val="20"/>
-        </w:rPr>
+      <w:pPr>
+        <w:pStyle w:val="Code"/>
+      </w:pPr>
+      <w:r>
         <w:t xml:space="preserve">Khi lễ tân mở danh sách lịch,</w:t>
       </w:r>
     </w:p>
     <w:p>
-      <w:r>
-        <w:rPr>
-          <w:rFonts w:ascii="Consolas" w:cs="Consolas" w:eastAsia="Consolas" w:hAnsi="Consolas"/>
-          <w:sz w:val="20"/>
-          <w:szCs w:val="20"/>
-        </w:rPr>
+      <w:pPr>
+        <w:pStyle w:val="Code"/>
+      </w:pPr>
+      <w:r>
         <w:t xml:space="preserve">hệ thống phải trả kèm allowed_actions và lock_reason cho từng lịch.</w:t>
       </w:r>
     </w:p>
     <w:p/>
     <w:p>
-      <w:r>
-        <w:rPr>
-          <w:rFonts w:ascii="Consolas" w:cs="Consolas" w:eastAsia="Consolas" w:hAnsi="Consolas"/>
-          <w:sz w:val="20"/>
-          <w:szCs w:val="20"/>
-        </w:rPr>
+      <w:pPr>
+        <w:pStyle w:val="Code"/>
+      </w:pPr>
+      <w:r>
         <w:t xml:space="preserve">Khi lễ tân bấm dời/hủy/check-in,</w:t>
       </w:r>
     </w:p>
     <w:p>
-      <w:r>
-        <w:rPr>
-          <w:rFonts w:ascii="Consolas" w:cs="Consolas" w:eastAsia="Consolas" w:hAnsi="Consolas"/>
-          <w:sz w:val="20"/>
-          <w:szCs w:val="20"/>
-        </w:rPr>
+      <w:pPr>
+        <w:pStyle w:val="Code"/>
+      </w:pPr>
+      <w:r>
         <w:t xml:space="preserve">backend phải kiểm lại cùng một bộ luật,</w:t>
       </w:r>
     </w:p>
     <w:p>
-      <w:r>
-        <w:rPr>
-          <w:rFonts w:ascii="Consolas" w:cs="Consolas" w:eastAsia="Consolas" w:hAnsi="Consolas"/>
-          <w:sz w:val="20"/>
-          <w:szCs w:val="20"/>
-        </w:rPr>
+      <w:pPr>
+        <w:pStyle w:val="Code"/>
+      </w:pPr>
+      <w:r>
         <w:t xml:space="preserve">không tin hoàn toàn vào frontend.</w:t>
       </w:r>
     </w:p>
     <w:p/>
     <w:p>
-      <w:r>
-        <w:rPr>
-          <w:rFonts w:ascii="Consolas" w:cs="Consolas" w:eastAsia="Consolas" w:hAnsi="Consolas"/>
-          <w:sz w:val="20"/>
-          <w:szCs w:val="20"/>
-        </w:rPr>
+      <w:pPr>
+        <w:pStyle w:val="Code"/>
+      </w:pPr>
+      <w:r>
         <w:t xml:space="preserve">Khi thao tác được ghi lịch sử,</w:t>
       </w:r>
     </w:p>
     <w:p>
-      <w:r>
-        <w:rPr>
-          <w:rFonts w:ascii="Consolas" w:cs="Consolas" w:eastAsia="Consolas" w:hAnsi="Consolas"/>
-          <w:sz w:val="20"/>
-          <w:szCs w:val="20"/>
-        </w:rPr>
+      <w:pPr>
+        <w:pStyle w:val="Code"/>
+      </w:pPr>
+      <w:r>
         <w:t xml:space="preserve">vai trò phải là receptionist nếu người thao tác là lễ tân.</w:t>
       </w:r>
     </w:p>
@@ -1417,61 +1039,31 @@
     <w:p/>
     <w:p>
       <w:r>
-        <w:rPr>
-          <w:rFonts w:ascii="Consolas" w:cs="Consolas" w:eastAsia="Consolas" w:hAnsi="Consolas"/>
-          <w:sz w:val="18"/>
-          <w:szCs w:val="18"/>
-        </w:rPr>
         <w:t xml:space="preserve">| Action | Được phép khi | Bị khóa khi |</w:t>
       </w:r>
     </w:p>
     <w:p>
       <w:r>
-        <w:rPr>
-          <w:rFonts w:ascii="Consolas" w:cs="Consolas" w:eastAsia="Consolas" w:hAnsi="Consolas"/>
-          <w:sz w:val="18"/>
-          <w:szCs w:val="18"/>
-        </w:rPr>
         <w:t xml:space="preserve">|---|---|---|</w:t>
       </w:r>
     </w:p>
     <w:p>
       <w:r>
-        <w:rPr>
-          <w:rFonts w:ascii="Consolas" w:cs="Consolas" w:eastAsia="Consolas" w:hAnsi="Consolas"/>
-          <w:sz w:val="18"/>
-          <w:szCs w:val="18"/>
-        </w:rPr>
         <w:t xml:space="preserve">| check_in | LichHen.status='confirmed', lịch hôm nay, chưa có HangDoi | đã có HangDoi, lịch không phải hôm nay, pending, cancelled, completed, no_show, skipped |</w:t>
       </w:r>
     </w:p>
     <w:p>
       <w:r>
-        <w:rPr>
-          <w:rFonts w:ascii="Consolas" w:cs="Consolas" w:eastAsia="Consolas" w:hAnsi="Consolas"/>
-          <w:sz w:val="18"/>
-          <w:szCs w:val="18"/>
-        </w:rPr>
         <w:t xml:space="preserve">| reschedule | lịch chưa kết thúc, chưa vào phòng, không có đề xuất dời đang mở | in_progress, completed, cancelled, no_show, skipped, HangDoi.trang_thai='trong_phong' |</w:t>
       </w:r>
     </w:p>
     <w:p>
       <w:r>
-        <w:rPr>
-          <w:rFonts w:ascii="Consolas" w:cs="Consolas" w:eastAsia="Consolas" w:hAnsi="Consolas"/>
-          <w:sz w:val="18"/>
-          <w:szCs w:val="18"/>
-        </w:rPr>
         <w:t xml:space="preserve">| cancel | thường chỉ pending hoặc confirmed, chưa vào hàng đợi khám thực tế | checked_in, in_progress, waiting_record, waiting_doctor_confirm, completed, cancelled, no_show, skipped, hoặc HangDoi.trang_thai không còn là trước khám |</w:t>
       </w:r>
     </w:p>
     <w:p>
       <w:r>
-        <w:rPr>
-          <w:rFonts w:ascii="Consolas" w:cs="Consolas" w:eastAsia="Consolas" w:hAnsi="Consolas"/>
-          <w:sz w:val="18"/>
-          <w:szCs w:val="18"/>
-        </w:rPr>
         <w:t xml:space="preserve">| view_only | mọi trạng thái | dùng khi không còn action ghi nào hợp lệ |</w:t>
       </w:r>
     </w:p>
@@ -1483,113 +1075,91 @@
     </w:p>
     <w:p/>
     <w:p>
-      <w:r>
-        <w:rPr>
-          <w:rFonts w:ascii="Consolas" w:cs="Consolas" w:eastAsia="Consolas" w:hAnsi="Consolas"/>
-          <w:sz w:val="20"/>
-          <w:szCs w:val="20"/>
-        </w:rPr>
+      <w:pPr>
+        <w:pStyle w:val="Code"/>
+      </w:pPr>
+      <w:r>
         <w:t xml:space="preserve">Lễ tân mở danh sách lịch</w:t>
       </w:r>
     </w:p>
     <w:p>
-      <w:r>
-        <w:rPr>
-          <w:rFonts w:ascii="Consolas" w:cs="Consolas" w:eastAsia="Consolas" w:hAnsi="Consolas"/>
-          <w:sz w:val="20"/>
-          <w:szCs w:val="20"/>
-        </w:rPr>
+      <w:pPr>
+        <w:pStyle w:val="Code"/>
+      </w:pPr>
+      <w:r>
         <w:t xml:space="preserve">  -&gt; API /receptionist/appointments lấy LichHen</w:t>
       </w:r>
     </w:p>
     <w:p>
-      <w:r>
-        <w:rPr>
-          <w:rFonts w:ascii="Consolas" w:cs="Consolas" w:eastAsia="Consolas" w:hAnsi="Consolas"/>
-          <w:sz w:val="20"/>
-          <w:szCs w:val="20"/>
-        </w:rPr>
+      <w:pPr>
+        <w:pStyle w:val="Code"/>
+      </w:pPr>
+      <w:r>
         <w:t xml:space="preserve">  -&gt; backend gom HangDoi theo appointment_id</w:t>
       </w:r>
     </w:p>
     <w:p>
-      <w:r>
-        <w:rPr>
-          <w:rFonts w:ascii="Consolas" w:cs="Consolas" w:eastAsia="Consolas" w:hAnsi="Consolas"/>
-          <w:sz w:val="20"/>
-          <w:szCs w:val="20"/>
-        </w:rPr>
+      <w:pPr>
+        <w:pStyle w:val="Code"/>
+      </w:pPr>
+      <w:r>
         <w:t xml:space="preserve">  -&gt; helper tính allowed_actions + lock_reason</w:t>
       </w:r>
     </w:p>
     <w:p>
-      <w:r>
-        <w:rPr>
-          <w:rFonts w:ascii="Consolas" w:cs="Consolas" w:eastAsia="Consolas" w:hAnsi="Consolas"/>
-          <w:sz w:val="20"/>
-          <w:szCs w:val="20"/>
-        </w:rPr>
+      <w:pPr>
+        <w:pStyle w:val="Code"/>
+      </w:pPr>
+      <w:r>
         <w:t xml:space="preserve">  -&gt; frontend chỉ hiển thị nút theo allowed_actions</w:t>
       </w:r>
     </w:p>
     <w:p/>
     <w:p>
-      <w:r>
-        <w:rPr>
-          <w:rFonts w:ascii="Consolas" w:cs="Consolas" w:eastAsia="Consolas" w:hAnsi="Consolas"/>
-          <w:sz w:val="20"/>
-          <w:szCs w:val="20"/>
-        </w:rPr>
+      <w:pPr>
+        <w:pStyle w:val="Code"/>
+      </w:pPr>
+      <w:r>
         <w:t xml:space="preserve">Lễ tân bấm một action</w:t>
       </w:r>
     </w:p>
     <w:p>
-      <w:r>
-        <w:rPr>
-          <w:rFonts w:ascii="Consolas" w:cs="Consolas" w:eastAsia="Consolas" w:hAnsi="Consolas"/>
-          <w:sz w:val="20"/>
-          <w:szCs w:val="20"/>
-        </w:rPr>
+      <w:pPr>
+        <w:pStyle w:val="Code"/>
+      </w:pPr>
+      <w:r>
         <w:t xml:space="preserve">  -&gt; backend đọc lại LichHen + HangDoi mới nhất</w:t>
       </w:r>
     </w:p>
     <w:p>
-      <w:r>
-        <w:rPr>
-          <w:rFonts w:ascii="Consolas" w:cs="Consolas" w:eastAsia="Consolas" w:hAnsi="Consolas"/>
-          <w:sz w:val="20"/>
-          <w:szCs w:val="20"/>
-        </w:rPr>
+      <w:pPr>
+        <w:pStyle w:val="Code"/>
+      </w:pPr>
+      <w:r>
         <w:t xml:space="preserve">  -&gt; helper kiểm tra lại quyền thao tác</w:t>
       </w:r>
     </w:p>
     <w:p>
-      <w:r>
-        <w:rPr>
-          <w:rFonts w:ascii="Consolas" w:cs="Consolas" w:eastAsia="Consolas" w:hAnsi="Consolas"/>
-          <w:sz w:val="20"/>
-          <w:szCs w:val="20"/>
-        </w:rPr>
+      <w:pPr>
+        <w:pStyle w:val="Code"/>
+      </w:pPr>
+      <w:r>
         <w:t xml:space="preserve">  -&gt; nếu bị khóa: trả 409 kèm lock_reason</w:t>
       </w:r>
     </w:p>
     <w:p>
-      <w:r>
-        <w:rPr>
-          <w:rFonts w:ascii="Consolas" w:cs="Consolas" w:eastAsia="Consolas" w:hAnsi="Consolas"/>
-          <w:sz w:val="20"/>
-          <w:szCs w:val="20"/>
-        </w:rPr>
+      <w:pPr>
+        <w:pStyle w:val="Code"/>
+      </w:pPr>
+      <w:r>
         <w:t xml:space="preserve">  -&gt; nếu hợp lệ: controller nghiệp vụ mới được ghi dữ liệu</w:t>
       </w:r>
     </w:p>
     <w:p>
-      <w:r>
-        <w:rPr>
-          <w:rFonts w:ascii="Consolas" w:cs="Consolas" w:eastAsia="Consolas" w:hAnsi="Consolas"/>
-          <w:sz w:val="20"/>
-          <w:szCs w:val="20"/>
-        </w:rPr>
+      <w:pPr>
+        <w:pStyle w:val="Code"/>
+      </w:pPr>
+      <w:r>
         <w:t xml:space="preserve">  -&gt; ghi LichSuLichHen với vai_tro đúng</w:t>
       </w:r>
     </w:p>
@@ -1608,91 +1178,46 @@
     <w:p/>
     <w:p>
       <w:r>
-        <w:rPr>
-          <w:rFonts w:ascii="Consolas" w:cs="Consolas" w:eastAsia="Consolas" w:hAnsi="Consolas"/>
-          <w:sz w:val="18"/>
-          <w:szCs w:val="18"/>
-        </w:rPr>
         <w:t xml:space="preserve">| Khu vực bị ảnh hưởng | Rủi ro | Cách tránh |</w:t>
       </w:r>
     </w:p>
     <w:p>
       <w:r>
-        <w:rPr>
-          <w:rFonts w:ascii="Consolas" w:cs="Consolas" w:eastAsia="Consolas" w:hAnsi="Consolas"/>
-          <w:sz w:val="18"/>
-          <w:szCs w:val="18"/>
-        </w:rPr>
         <w:t xml:space="preserve">|---|---|---|</w:t>
       </w:r>
     </w:p>
     <w:p>
       <w:r>
-        <w:rPr>
-          <w:rFonts w:ascii="Consolas" w:cs="Consolas" w:eastAsia="Consolas" w:hAnsi="Consolas"/>
-          <w:sz w:val="18"/>
-          <w:szCs w:val="18"/>
-        </w:rPr>
         <w:t xml:space="preserve">| Check-in | Nếu đổi điều kiện check-in quá rộng, lịch pending/unpaid có thể vào hàng đợi. | Giữ service checkInLichHen hiện có; chỉ bọc thêm helper action, không nới trạng thái check-in. |</w:t>
       </w:r>
     </w:p>
     <w:p>
       <w:r>
-        <w:rPr>
-          <w:rFonts w:ascii="Consolas" w:cs="Consolas" w:eastAsia="Consolas" w:hAnsi="Consolas"/>
-          <w:sz w:val="18"/>
-          <w:szCs w:val="18"/>
-        </w:rPr>
         <w:t xml:space="preserve">| Dời lịch | Nếu chỉ nhìn LichHen.status, có thể dời ca đã có HangDoi.trong_phong. | Guard phải đọc cả HangDoi. |</w:t>
       </w:r>
     </w:p>
     <w:p>
       <w:r>
-        <w:rPr>
-          <w:rFonts w:ascii="Consolas" w:cs="Consolas" w:eastAsia="Consolas" w:hAnsi="Consolas"/>
-          <w:sz w:val="18"/>
-          <w:szCs w:val="18"/>
-        </w:rPr>
         <w:t xml:space="preserve">| Hủy lịch | Nếu trả slot về active khi lịch đã vào khám, người khác có thể đặt trùng slot đang dùng. | Chỉ cho hủy trước check-in; các trường hợp sau check-in chuyển sang luồng hàng đợi/bác sĩ/hóa đơn riêng. |</w:t>
       </w:r>
     </w:p>
     <w:p>
       <w:r>
-        <w:rPr>
-          <w:rFonts w:ascii="Consolas" w:cs="Consolas" w:eastAsia="Consolas" w:hAnsi="Consolas"/>
-          <w:sz w:val="18"/>
-          <w:szCs w:val="18"/>
-        </w:rPr>
         <w:t xml:space="preserve">| Bác sĩ | Nếu lễ tân đổi lịch khi bác sĩ đang xem hàng đợi, dashboard bác sĩ lệch. | Khóa trong_phong, in_progress; emit realtime sau khi action hợp lệ. |</w:t>
       </w:r>
     </w:p>
     <w:p>
       <w:r>
-        <w:rPr>
-          <w:rFonts w:ascii="Consolas" w:cs="Consolas" w:eastAsia="Consolas" w:hAnsi="Consolas"/>
-          <w:sz w:val="18"/>
-          <w:szCs w:val="18"/>
-        </w:rPr>
         <w:t xml:space="preserve">| Admin | Admin đang dùng vai_tro='admin'; thêm receptionist vào enum phải không làm hỏng dữ liệu cũ. | Chỉ mở rộng enum, không migrate lịch sử cũ ngay. Lịch sử cũ vẫn đọc được. |</w:t>
       </w:r>
     </w:p>
     <w:p>
       <w:r>
-        <w:rPr>
-          <w:rFonts w:ascii="Consolas" w:cs="Consolas" w:eastAsia="Consolas" w:hAnsi="Consolas"/>
-          <w:sz w:val="18"/>
-          <w:szCs w:val="18"/>
-        </w:rPr>
         <w:t xml:space="preserve">| Frontend | Nếu frontend chỉ dựa vào status cũ, UI vẫn hiện sai. | API trả allowed_actions; frontend đổi từ tự suy status sang dùng contract backend. |</w:t>
       </w:r>
     </w:p>
     <w:p>
       <w:r>
-        <w:rPr>
-          <w:rFonts w:ascii="Consolas" w:cs="Consolas" w:eastAsia="Consolas" w:hAnsi="Consolas"/>
-          <w:sz w:val="18"/>
-          <w:szCs w:val="18"/>
-        </w:rPr>
         <w:t xml:space="preserve">| Thống kê | Nếu helper trạng thái không cập nhật đủ enum, số liệu “đang khám/chờ hồ sơ/bỏ lượt” sai. | Cập nhật appointmentStatus.js làm nguồn dùng chung, có nhóm trạng thái rõ. |</w:t>
       </w:r>
     </w:p>
@@ -1726,32 +1251,26 @@
     </w:p>
     <w:p/>
     <w:p>
-      <w:r>
-        <w:rPr>
-          <w:rFonts w:ascii="Consolas" w:cs="Consolas" w:eastAsia="Consolas" w:hAnsi="Consolas"/>
-          <w:sz w:val="20"/>
-          <w:szCs w:val="20"/>
-        </w:rPr>
+      <w:pPr>
+        <w:pStyle w:val="Code"/>
+      </w:pPr>
+      <w:r>
         <w:t xml:space="preserve">allowed_actions: ['check_in', 'reschedule', 'cancel']</w:t>
       </w:r>
     </w:p>
     <w:p>
-      <w:r>
-        <w:rPr>
-          <w:rFonts w:ascii="Consolas" w:cs="Consolas" w:eastAsia="Consolas" w:hAnsi="Consolas"/>
-          <w:sz w:val="20"/>
-          <w:szCs w:val="20"/>
-        </w:rPr>
+      <w:pPr>
+        <w:pStyle w:val="Code"/>
+      </w:pPr>
+      <w:r>
         <w:t xml:space="preserve">lock_reason: null</w:t>
       </w:r>
     </w:p>
     <w:p>
-      <w:r>
-        <w:rPr>
-          <w:rFonts w:ascii="Consolas" w:cs="Consolas" w:eastAsia="Consolas" w:hAnsi="Consolas"/>
-          <w:sz w:val="20"/>
-          <w:szCs w:val="20"/>
-        </w:rPr>
+      <w:pPr>
+        <w:pStyle w:val="Code"/>
+      </w:pPr>
+      <w:r>
         <w:t xml:space="preserve">queue_state: null | 'dang_cho' | 'da_goi' | 'trong_phong' | ...</w:t>
       </w:r>
     </w:p>
@@ -1770,101 +1289,51 @@
     <w:p/>
     <w:p>
       <w:r>
-        <w:rPr>
-          <w:rFonts w:ascii="Consolas" w:cs="Consolas" w:eastAsia="Consolas" w:hAnsi="Consolas"/>
-          <w:sz w:val="18"/>
-          <w:szCs w:val="18"/>
-        </w:rPr>
         <w:t xml:space="preserve">| Contract | Quyết định đề xuất |</w:t>
       </w:r>
     </w:p>
     <w:p>
       <w:r>
-        <w:rPr>
-          <w:rFonts w:ascii="Consolas" w:cs="Consolas" w:eastAsia="Consolas" w:hAnsi="Consolas"/>
-          <w:sz w:val="18"/>
-          <w:szCs w:val="18"/>
-        </w:rPr>
         <w:t xml:space="preserve">|---|---|</w:t>
       </w:r>
     </w:p>
     <w:p>
       <w:r>
-        <w:rPr>
-          <w:rFonts w:ascii="Consolas" w:cs="Consolas" w:eastAsia="Consolas" w:hAnsi="Consolas"/>
-          <w:sz w:val="18"/>
-          <w:szCs w:val="18"/>
-        </w:rPr>
         <w:t xml:space="preserve">| Trạng thái đầu vào | LichHen.status kết hợp HangDoi.trang_thai, không dùng riêng một lớp. |</w:t>
       </w:r>
     </w:p>
     <w:p>
       <w:r>
-        <w:rPr>
-          <w:rFonts w:ascii="Consolas" w:cs="Consolas" w:eastAsia="Consolas" w:hAnsi="Consolas"/>
-          <w:sz w:val="18"/>
-          <w:szCs w:val="18"/>
-        </w:rPr>
         <w:t xml:space="preserve">| Trạng thái đầu ra | LT-00 không đổi nghiệp vụ trạng thái, chỉ chuẩn hóa quyền action. |</w:t>
       </w:r>
     </w:p>
     <w:p>
       <w:r>
-        <w:rPr>
-          <w:rFonts w:ascii="Consolas" w:cs="Consolas" w:eastAsia="Consolas" w:hAnsi="Consolas"/>
-          <w:sz w:val="18"/>
-          <w:szCs w:val="18"/>
-        </w:rPr>
         <w:t xml:space="preserve">| Quyền actor | Route vẫn cho receptionist và admin; audit ghi đúng req.user.role. |</w:t>
       </w:r>
     </w:p>
     <w:p>
       <w:r>
-        <w:rPr>
-          <w:rFonts w:ascii="Consolas" w:cs="Consolas" w:eastAsia="Consolas" w:hAnsi="Consolas"/>
-          <w:sz w:val="18"/>
-          <w:szCs w:val="18"/>
-        </w:rPr>
         <w:t xml:space="preserve">| Audit | Mở enum receptionist; chưa bắt buộc mọi action phải có audit trong LT-00, nhưng không được ghi lễ tân thành admin nữa. |</w:t>
       </w:r>
     </w:p>
     <w:p>
       <w:r>
-        <w:rPr>
-          <w:rFonts w:ascii="Consolas" w:cs="Consolas" w:eastAsia="Consolas" w:hAnsi="Consolas"/>
-          <w:sz w:val="18"/>
-          <w:szCs w:val="18"/>
-        </w:rPr>
         <w:t xml:space="preserve">| Thông báo | LT-00 chưa gửi thông báo; chỉ chuẩn bị nền cho LT-08. |</w:t>
       </w:r>
     </w:p>
     <w:p>
       <w:r>
-        <w:rPr>
-          <w:rFonts w:ascii="Consolas" w:cs="Consolas" w:eastAsia="Consolas" w:hAnsi="Consolas"/>
-          <w:sz w:val="18"/>
-          <w:szCs w:val="18"/>
-        </w:rPr>
         <w:t xml:space="preserve">| Transaction | LT-00 chưa đổi transaction chính; các task sau sẽ áp dụng theo từng action. |</w:t>
       </w:r>
     </w:p>
     <w:p>
       <w:r>
-        <w:rPr>
-          <w:rFonts w:ascii="Consolas" w:cs="Consolas" w:eastAsia="Consolas" w:hAnsi="Consolas"/>
-          <w:sz w:val="18"/>
-          <w:szCs w:val="18"/>
-        </w:rPr>
         <w:t xml:space="preserve">| API/UI | Backend trả allowed_actions, lock_reason; frontend đọc từ API để bật/tắt nút. |</w:t>
       </w:r>
     </w:p>
     <w:p>
       <w:r>
-        <w:rPr>
-          <w:rFonts w:ascii="Consolas" w:cs="Consolas" w:eastAsia="Consolas" w:hAnsi="Consolas"/>
-          <w:sz w:val="18"/>
-          <w:szCs w:val="18"/>
-        </w:rPr>
         <w:t xml:space="preserve">| Test liên chức năng | Test lịch confirmed, checked_in, in_progress, completed, có/không có HangDoi.trong_phong. |</w:t>
       </w:r>
     </w:p>
@@ -1901,7 +1370,11 @@
       </w:r>
     </w:p>
     <w:p/>
-    <w:p/>
+    <w:p>
+      <w:r>
+        <w:t xml:space="preserve">---</w:t>
+      </w:r>
+    </w:p>
     <w:p/>
     <w:p>
       <w:pPr>
@@ -1931,82 +1404,66 @@
     </w:p>
     <w:p/>
     <w:p>
-      <w:r>
-        <w:rPr>
-          <w:rFonts w:ascii="Consolas" w:cs="Consolas" w:eastAsia="Consolas" w:hAnsi="Consolas"/>
-          <w:sz w:val="20"/>
-          <w:szCs w:val="20"/>
-        </w:rPr>
+      <w:pPr>
+        <w:pStyle w:val="Code"/>
+      </w:pPr>
+      <w:r>
         <w:t xml:space="preserve">Admin/lễ tân xác nhận sự cố của bác sĩ</w:t>
       </w:r>
     </w:p>
     <w:p>
-      <w:r>
-        <w:rPr>
-          <w:rFonts w:ascii="Consolas" w:cs="Consolas" w:eastAsia="Consolas" w:hAnsi="Consolas"/>
-          <w:sz w:val="20"/>
-          <w:szCs w:val="20"/>
-        </w:rPr>
+      <w:pPr>
+        <w:pStyle w:val="Code"/>
+      </w:pPr>
+      <w:r>
         <w:t xml:space="preserve">  -&gt; hệ thống lấy các lịch chưa vào phòng bị ảnh hưởng</w:t>
       </w:r>
     </w:p>
     <w:p>
-      <w:r>
-        <w:rPr>
-          <w:rFonts w:ascii="Consolas" w:cs="Consolas" w:eastAsia="Consolas" w:hAnsi="Consolas"/>
-          <w:sz w:val="20"/>
-          <w:szCs w:val="20"/>
-        </w:rPr>
+      <w:pPr>
+        <w:pStyle w:val="Code"/>
+      </w:pPr>
+      <w:r>
         <w:t xml:space="preserve">  -&gt; tìm tối đa 3 phương án còn trống: cùng chuyên khoa, bác sĩ thay thế, khung gần nhất</w:t>
       </w:r>
     </w:p>
     <w:p>
-      <w:r>
-        <w:rPr>
-          <w:rFonts w:ascii="Consolas" w:cs="Consolas" w:eastAsia="Consolas" w:hAnsi="Consolas"/>
-          <w:sz w:val="20"/>
-          <w:szCs w:val="20"/>
-        </w:rPr>
+      <w:pPr>
+        <w:pStyle w:val="Code"/>
+      </w:pPr>
+      <w:r>
         <w:t xml:space="preserve">  -&gt; giữ tạm slot của phương án đầu tiên</w:t>
       </w:r>
     </w:p>
     <w:p>
-      <w:r>
-        <w:rPr>
-          <w:rFonts w:ascii="Consolas" w:cs="Consolas" w:eastAsia="Consolas" w:hAnsi="Consolas"/>
-          <w:sz w:val="20"/>
-          <w:szCs w:val="20"/>
-        </w:rPr>
+      <w:pPr>
+        <w:pStyle w:val="Code"/>
+      </w:pPr>
+      <w:r>
         <w:t xml:space="preserve">  -&gt; lễ tân kiểm tra và gửi thông báo cho từng khách</w:t>
       </w:r>
     </w:p>
     <w:p>
-      <w:r>
-        <w:rPr>
-          <w:rFonts w:ascii="Consolas" w:cs="Consolas" w:eastAsia="Consolas" w:hAnsi="Consolas"/>
-          <w:sz w:val="20"/>
-          <w:szCs w:val="20"/>
-        </w:rPr>
+      <w:pPr>
+        <w:pStyle w:val="Code"/>
+      </w:pPr>
+      <w:r>
         <w:t xml:space="preserve">  -&gt; khách chọn phương án hoặc lễ tân ghi nhận lựa chọn qua điện thoại</w:t>
       </w:r>
     </w:p>
     <w:p>
-      <w:r>
-        <w:rPr>
-          <w:rFonts w:ascii="Consolas" w:cs="Consolas" w:eastAsia="Consolas" w:hAnsi="Consolas"/>
-          <w:sz w:val="20"/>
-          <w:szCs w:val="20"/>
-        </w:rPr>
+      <w:pPr>
+        <w:pStyle w:val="Code"/>
+      </w:pPr>
+      <w:r>
         <w:t xml:space="preserve">  -&gt; áp dụng một phương án, cập nhật lịch và lưu audit</w:t>
       </w:r>
     </w:p>
     <w:p>
-      <w:r>
-        <w:rPr>
-          <w:rFonts w:ascii="Consolas" w:cs="Consolas" w:eastAsia="Consolas" w:hAnsi="Consolas"/>
-          <w:sz w:val="20"/>
-          <w:szCs w:val="20"/>
-        </w:rPr>
+      <w:pPr>
+        <w:pStyle w:val="Code"/>
+      </w:pPr>
+      <w:r>
         <w:t xml:space="preserve">  -&gt; giải phóng các phương án tạm còn lại</w:t>
       </w:r>
     </w:p>
@@ -2018,49 +1475,21 @@
     </w:p>
     <w:p/>
     <w:p>
-      <w:pPr>
-        <w:pStyle w:val="ListParagraph"/>
-        <w:numPr>
-          <w:ilvl w:val="0"/>
-          <w:numId w:val="1"/>
-        </w:numPr>
-      </w:pPr>
       <w:r>
         <w:t xml:space="preserve">? Chỉ ảnh hưởng lịch chưa vào phòng: pending, confirmed, checked_in hoặc hàng đợi đang chờ. Lịch in_progress/trong_phong là ca đang thực hiện, không chuyển bác sĩ từ phía lễ tân.</w:t>
       </w:r>
     </w:p>
     <w:p>
-      <w:pPr>
-        <w:pStyle w:val="ListParagraph"/>
-        <w:numPr>
-          <w:ilvl w:val="0"/>
-          <w:numId w:val="1"/>
-        </w:numPr>
-      </w:pPr>
       <w:r>
         <w:t xml:space="preserve">? Ưu tiên cùng chuyên khoa, cùng ngày, thời gian gần nhất. Chỉ đưa bác sĩ có lịch làm việc và slot hợp lệ.</w:t>
       </w:r>
     </w:p>
     <w:p>
-      <w:pPr>
-        <w:pStyle w:val="ListParagraph"/>
-        <w:numPr>
-          <w:ilvl w:val="0"/>
-          <w:numId w:val="1"/>
-        </w:numPr>
-      </w:pPr>
       <w:r>
         <w:t xml:space="preserve">? Không chuyển tự động sang bác sĩ khác chỉ vì có chỗ trống. Nếu khách không phản hồi trong thời hạn đã định, áp dụng phương án đầu tiên đã giữ chỗ theo quy tắc phòng khám và lưu rõ cách liên hệ.</w:t>
       </w:r>
     </w:p>
     <w:p>
-      <w:pPr>
-        <w:pStyle w:val="ListParagraph"/>
-        <w:numPr>
-          <w:ilvl w:val="0"/>
-          <w:numId w:val="1"/>
-        </w:numPr>
-      </w:pPr>
       <w:r>
         <w:t xml:space="preserve">? Với khách đã check-in nhưng chưa được gọi, chuyển hoặc đưa vào trạng thái chờ điều phối; không tạo thêm HangDoi thứ hai.</w:t>
       </w:r>
@@ -2068,7 +1497,7 @@
     <w:p/>
     <w:p>
       <w:r>
-        <w:t xml:space="preserve">Giải pháp kỹ thuật đơn giản: tận dụng LichHen.de_xuat_doi.phuong_an[] đang có thay vì tạo collection điều phối mới. Bổ sung endpoint theo lô chỉ để tạo đề xuất, còn việc áp dụng vẫn gọi chung apDungPhuongAn() cho từng lịch trong transaction. Không cho API nhận doctor_id tùy ý.</w:t>
+        <w:t xml:space="preserve">Giải pháp kỹ thuật đơn giản: tận dụng LichHen.de_xuat_doi.phuong_an[] đang có thay vì tạo collection điều phối mới. Bổ sung endpoint theo lô chỉ để *tạo đề xuất*, còn việc áp dụng vẫn gọi chung apDungPhuongAn() cho từng lịch trong transaction. Không cho API nhận doctor_id tùy ý.</w:t>
       </w:r>
     </w:p>
     <w:p/>
@@ -2084,7 +1513,11 @@
       </w:r>
     </w:p>
     <w:p/>
-    <w:p/>
+    <w:p>
+      <w:r>
+        <w:t xml:space="preserve">---</w:t>
+      </w:r>
+    </w:p>
     <w:p/>
     <w:p>
       <w:pPr>
@@ -2120,82 +1553,66 @@
     </w:p>
     <w:p/>
     <w:p>
-      <w:r>
-        <w:rPr>
-          <w:rFonts w:ascii="Consolas" w:cs="Consolas" w:eastAsia="Consolas" w:hAnsi="Consolas"/>
-          <w:sz w:val="20"/>
-          <w:szCs w:val="20"/>
-        </w:rPr>
+      <w:pPr>
+        <w:pStyle w:val="Code"/>
+      </w:pPr>
+      <w:r>
         <w:t xml:space="preserve">Khách đến sau giờ hẹn</w:t>
       </w:r>
     </w:p>
     <w:p>
-      <w:r>
-        <w:rPr>
-          <w:rFonts w:ascii="Consolas" w:cs="Consolas" w:eastAsia="Consolas" w:hAnsi="Consolas"/>
-          <w:sz w:val="20"/>
-          <w:szCs w:val="20"/>
-        </w:rPr>
+      <w:pPr>
+        <w:pStyle w:val="Code"/>
+      </w:pPr>
+      <w:r>
         <w:t xml:space="preserve">  -&gt; lễ tân chọn Check-in và hệ thống tính số phút trễ</w:t>
       </w:r>
     </w:p>
     <w:p>
-      <w:r>
-        <w:rPr>
-          <w:rFonts w:ascii="Consolas" w:cs="Consolas" w:eastAsia="Consolas" w:hAnsi="Consolas"/>
-          <w:sz w:val="20"/>
-          <w:szCs w:val="20"/>
-        </w:rPr>
+      <w:pPr>
+        <w:pStyle w:val="Code"/>
+      </w:pPr>
+      <w:r>
         <w:t xml:space="preserve">  -&gt; nếu còn nhận trong ca: tạo HangDoi, gắn mức ưu tiên muộn</w:t>
       </w:r>
     </w:p>
     <w:p>
-      <w:r>
-        <w:rPr>
-          <w:rFonts w:ascii="Consolas" w:cs="Consolas" w:eastAsia="Consolas" w:hAnsi="Consolas"/>
-          <w:sz w:val="20"/>
-          <w:szCs w:val="20"/>
-        </w:rPr>
+      <w:pPr>
+        <w:pStyle w:val="Code"/>
+      </w:pPr>
+      <w:r>
         <w:t xml:space="preserve">  -&gt; lễ tân chọn một trong ba phương án được backend cho phép</w:t>
       </w:r>
     </w:p>
     <w:p>
-      <w:r>
-        <w:rPr>
-          <w:rFonts w:ascii="Consolas" w:cs="Consolas" w:eastAsia="Consolas" w:hAnsi="Consolas"/>
-          <w:sz w:val="20"/>
-          <w:szCs w:val="20"/>
-        </w:rPr>
+      <w:pPr>
+        <w:pStyle w:val="Code"/>
+      </w:pPr>
+      <w:r>
         <w:t xml:space="preserve">       A. chờ cuối hàng đợi hiện tại</w:t>
       </w:r>
     </w:p>
     <w:p>
-      <w:r>
-        <w:rPr>
-          <w:rFonts w:ascii="Consolas" w:cs="Consolas" w:eastAsia="Consolas" w:hAnsi="Consolas"/>
-          <w:sz w:val="20"/>
-          <w:szCs w:val="20"/>
-        </w:rPr>
+      <w:pPr>
+        <w:pStyle w:val="Code"/>
+      </w:pPr>
+      <w:r>
         <w:t xml:space="preserve">       B. đặt vào slot trống gần nhất trong ngày</w:t>
       </w:r>
     </w:p>
     <w:p>
-      <w:r>
-        <w:rPr>
-          <w:rFonts w:ascii="Consolas" w:cs="Consolas" w:eastAsia="Consolas" w:hAnsi="Consolas"/>
-          <w:sz w:val="20"/>
-          <w:szCs w:val="20"/>
-        </w:rPr>
+      <w:pPr>
+        <w:pStyle w:val="Code"/>
+      </w:pPr>
+      <w:r>
         <w:t xml:space="preserve">       C. đề xuất dời sang ngày sau</w:t>
       </w:r>
     </w:p>
     <w:p>
-      <w:r>
-        <w:rPr>
-          <w:rFonts w:ascii="Consolas" w:cs="Consolas" w:eastAsia="Consolas" w:hAnsi="Consolas"/>
-          <w:sz w:val="20"/>
-          <w:szCs w:val="20"/>
-        </w:rPr>
+      <w:pPr>
+        <w:pStyle w:val="Code"/>
+      </w:pPr>
+      <w:r>
         <w:t xml:space="preserve">  -&gt; xác nhận với khách và gửi thông báo/xác nhận mới</w:t>
       </w:r>
     </w:p>
@@ -2207,49 +1624,21 @@
     </w:p>
     <w:p/>
     <w:p>
-      <w:pPr>
-        <w:pStyle w:val="ListParagraph"/>
-        <w:numPr>
-          <w:ilvl w:val="0"/>
-          <w:numId w:val="1"/>
-        </w:numPr>
-      </w:pPr>
       <w:r>
         <w:t xml:space="preserve">? Trễ nhưng vẫn còn khả năng phục vụ: check-in ngay, đưa về cuối hàng đợi theo thuật toán ưu tiên động. Đây là mặc định, ít thay đổi dữ liệu nhất.</w:t>
       </w:r>
     </w:p>
     <w:p>
-      <w:pPr>
-        <w:pStyle w:val="ListParagraph"/>
-        <w:numPr>
-          <w:ilvl w:val="0"/>
-          <w:numId w:val="1"/>
-        </w:numPr>
-      </w:pPr>
       <w:r>
         <w:t xml:space="preserve">? Khách muốn đổi sang slot trống trong ngày hoặc ngày sau: đây là reschedule có lý do phong_kham hoặc khach_yeu_cau đúng thực tế, gọi lại service dời lịch chung.</w:t>
       </w:r>
     </w:p>
     <w:p>
-      <w:pPr>
-        <w:pStyle w:val="ListParagraph"/>
-        <w:numPr>
-          <w:ilvl w:val="0"/>
-          <w:numId w:val="1"/>
-        </w:numPr>
-      </w:pPr>
       <w:r>
         <w:t xml:space="preserve">? Khi ca đã quá tải hoặc sắp hết giờ, không tạo lời hứa mơ hồ “chờ thêm”. Backend chỉ trả các slot thật sự còn chỗ/được phép chọn.</w:t>
       </w:r>
     </w:p>
     <w:p>
-      <w:pPr>
-        <w:pStyle w:val="ListParagraph"/>
-        <w:numPr>
-          <w:ilvl w:val="0"/>
-          <w:numId w:val="1"/>
-        </w:numPr>
-      </w:pPr>
       <w:r>
         <w:t xml:space="preserve">? Không tái sử dụng slot của người đã check-in. Slot thuộc lịch hủy mới có thể trở lại pool theo LT-04.</w:t>
       </w:r>
@@ -2267,7 +1656,11 @@
       </w:r>
     </w:p>
     <w:p/>
-    <w:p/>
+    <w:p>
+      <w:r>
+        <w:t xml:space="preserve">---</w:t>
+      </w:r>
+    </w:p>
     <w:p/>
     <w:p>
       <w:pPr>
@@ -2286,6 +1679,12 @@
     <w:p/>
     <w:p>
       <w:r>
+        <w:t xml:space="preserve">Tình trạng triển khai 2026-08-02: đã mở rộng API /receptionist/appointments/doctor-statuses để suy ra quá tải tạm thời từ HangDoi và queueOverflow.service.js, không ghi trạng thái quá tải dài hạn vào BacSi.trang_thai. API trả thêm do_tre_ca_phut, nguyen_nhan_do_tre, ngung_nhan_walkin, chan_dat_online, canh_bao_dieu_phoi, luot_cho_bi_anh_huong và lich_chua_checkin_bi_anh_huong. Dashboard lễ tân hiển thị bác sĩ quá tải, lượt đang chờ đã check-in, lịch chưa check-in cần gọi báo và thời gian chờ/trễ ước tính. Chức năng này chỉ cảnh báo và hỗ trợ điều phối; không tự động đổi gio_kham, không tự tạo slot lịch làm việc mới và không cho sửa lịch đã vào phòng.</w:t>
+      </w:r>
+    </w:p>
+    <w:p/>
+    <w:p>
+      <w:r>
         <w:t xml:space="preserve">Lỗi/gap hiện tại: khi một lượt trong_phong kéo dài đến một giờ, lịch phía sau có nguy cơ bị “đẩy dây chuyền”. Nếu lễ tân tự sửa giờ của tất cả lịch, hệ thống tạo hàng loạt thay đổi sai cam kết và bùng nổ thông báo.</w:t>
       </w:r>
     </w:p>
@@ -2297,72 +1696,58 @@
     </w:p>
     <w:p/>
     <w:p>
-      <w:r>
-        <w:rPr>
-          <w:rFonts w:ascii="Consolas" w:cs="Consolas" w:eastAsia="Consolas" w:hAnsi="Consolas"/>
-          <w:sz w:val="20"/>
-          <w:szCs w:val="20"/>
-        </w:rPr>
+      <w:pPr>
+        <w:pStyle w:val="Code"/>
+      </w:pPr>
+      <w:r>
         <w:t xml:space="preserve">Bác sĩ đánh dấu/ hệ thống phát hiện lượt trong phòng vượt ngưỡng</w:t>
       </w:r>
     </w:p>
     <w:p>
-      <w:r>
-        <w:rPr>
-          <w:rFonts w:ascii="Consolas" w:cs="Consolas" w:eastAsia="Consolas" w:hAnsi="Consolas"/>
-          <w:sz w:val="20"/>
-          <w:szCs w:val="20"/>
-        </w:rPr>
+      <w:pPr>
+        <w:pStyle w:val="Code"/>
+      </w:pPr>
+      <w:r>
         <w:t xml:space="preserve">  -&gt; trạng thái năng lực bác sĩ = qua_tai_tam_thoi, ghi mốc dự kiến tiếp tục</w:t>
       </w:r>
     </w:p>
     <w:p>
-      <w:r>
-        <w:rPr>
-          <w:rFonts w:ascii="Consolas" w:cs="Consolas" w:eastAsia="Consolas" w:hAnsi="Consolas"/>
-          <w:sz w:val="20"/>
-          <w:szCs w:val="20"/>
-        </w:rPr>
+      <w:pPr>
+        <w:pStyle w:val="Code"/>
+      </w:pPr>
+      <w:r>
         <w:t xml:space="preserve">  -&gt; hàng đợi hiện tại vẫn giữ nguyên thứ tự động</w:t>
       </w:r>
     </w:p>
     <w:p>
-      <w:r>
-        <w:rPr>
-          <w:rFonts w:ascii="Consolas" w:cs="Consolas" w:eastAsia="Consolas" w:hAnsi="Consolas"/>
-          <w:sz w:val="20"/>
-          <w:szCs w:val="20"/>
-        </w:rPr>
+      <w:pPr>
+        <w:pStyle w:val="Code"/>
+      </w:pPr>
+      <w:r>
         <w:t xml:space="preserve">  -&gt; lễ tân thấy danh sách lịch bị ảnh hưởng cùng thời gian chờ ước tính</w:t>
       </w:r>
     </w:p>
     <w:p>
-      <w:r>
-        <w:rPr>
-          <w:rFonts w:ascii="Consolas" w:cs="Consolas" w:eastAsia="Consolas" w:hAnsi="Consolas"/>
-          <w:sz w:val="20"/>
-          <w:szCs w:val="20"/>
-        </w:rPr>
+      <w:pPr>
+        <w:pStyle w:val="Code"/>
+      </w:pPr>
+      <w:r>
         <w:t xml:space="preserve">  -&gt; khách chưa check-in: nhận cảnh báo trễ, có thể chọn dời</w:t>
       </w:r>
     </w:p>
     <w:p>
-      <w:r>
-        <w:rPr>
-          <w:rFonts w:ascii="Consolas" w:cs="Consolas" w:eastAsia="Consolas" w:hAnsi="Consolas"/>
-          <w:sz w:val="20"/>
-          <w:szCs w:val="20"/>
-        </w:rPr>
+      <w:pPr>
+        <w:pStyle w:val="Code"/>
+      </w:pPr>
+      <w:r>
         <w:t xml:space="preserve">  -&gt; khách đã check-in: ở slot chờ, không đổi lịch hẹn nếu chưa cần</w:t>
       </w:r>
     </w:p>
     <w:p>
-      <w:r>
-        <w:rPr>
-          <w:rFonts w:ascii="Consolas" w:cs="Consolas" w:eastAsia="Consolas" w:hAnsi="Consolas"/>
-          <w:sz w:val="20"/>
-          <w:szCs w:val="20"/>
-        </w:rPr>
+      <w:pPr>
+        <w:pStyle w:val="Code"/>
+      </w:pPr>
+      <w:r>
         <w:t xml:space="preserve">  -&gt; khi bác sĩ hoạt động lại: gọi theo thứ tự hàng đợi</w:t>
       </w:r>
     </w:p>
@@ -2386,37 +1771,16 @@
     </w:p>
     <w:p/>
     <w:p>
-      <w:pPr>
-        <w:pStyle w:val="ListParagraph"/>
-        <w:numPr>
-          <w:ilvl w:val="0"/>
-          <w:numId w:val="1"/>
-        </w:numPr>
-      </w:pPr>
       <w:r>
         <w:t xml:space="preserve">? Bổ sung trạng thái tác nghiệp của bác sĩ theo ca: san_sang, dang_kham, qua_tai_tam_thoi, tam_dung_tiep_nhan, nghi_dot_xuat.</w:t>
       </w:r>
     </w:p>
     <w:p>
-      <w:pPr>
-        <w:pStyle w:val="ListParagraph"/>
-        <w:numPr>
-          <w:ilvl w:val="0"/>
-          <w:numId w:val="1"/>
-        </w:numPr>
-      </w:pPr>
       <w:r>
         <w:t xml:space="preserve">? Không ghi qua_tai_tam_thoi vào BacSi.trang_thai dài hạn; đặt ở ca hiện tại hoặc suy ra từ HangDoi.</w:t>
       </w:r>
     </w:p>
     <w:p>
-      <w:pPr>
-        <w:pStyle w:val="ListParagraph"/>
-        <w:numPr>
-          <w:ilvl w:val="0"/>
-          <w:numId w:val="1"/>
-        </w:numPr>
-      </w:pPr>
       <w:r>
         <w:t xml:space="preserve">? API dashboard lễ tân trả: ca đang quá tải, số lượt chờ, thời gian chờ ước tính và lịch chưa check-in bị ảnh hưởng.</w:t>
       </w:r>
@@ -2428,7 +1792,11 @@
       </w:r>
     </w:p>
     <w:p/>
-    <w:p/>
+    <w:p>
+      <w:r>
+        <w:t xml:space="preserve">---</w:t>
+      </w:r>
+    </w:p>
     <w:p/>
     <w:p>
       <w:pPr>
@@ -2464,62 +1832,50 @@
     </w:p>
     <w:p/>
     <w:p>
-      <w:r>
-        <w:rPr>
-          <w:rFonts w:ascii="Consolas" w:cs="Consolas" w:eastAsia="Consolas" w:hAnsi="Consolas"/>
-          <w:sz w:val="20"/>
-          <w:szCs w:val="20"/>
-        </w:rPr>
+      <w:pPr>
+        <w:pStyle w:val="Code"/>
+      </w:pPr>
+      <w:r>
         <w:t xml:space="preserve">Khách/lễ tân yêu cầu hủy</w:t>
       </w:r>
     </w:p>
     <w:p>
-      <w:r>
-        <w:rPr>
-          <w:rFonts w:ascii="Consolas" w:cs="Consolas" w:eastAsia="Consolas" w:hAnsi="Consolas"/>
-          <w:sz w:val="20"/>
-          <w:szCs w:val="20"/>
-        </w:rPr>
+      <w:pPr>
+        <w:pStyle w:val="Code"/>
+      </w:pPr>
+      <w:r>
         <w:t xml:space="preserve">  -&gt; backend kiểm tra lịch chưa check-in/chưa trong phòng</w:t>
       </w:r>
     </w:p>
     <w:p>
-      <w:r>
-        <w:rPr>
-          <w:rFonts w:ascii="Consolas" w:cs="Consolas" w:eastAsia="Consolas" w:hAnsi="Consolas"/>
-          <w:sz w:val="20"/>
-          <w:szCs w:val="20"/>
-        </w:rPr>
+      <w:pPr>
+        <w:pStyle w:val="Code"/>
+      </w:pPr>
+      <w:r>
         <w:t xml:space="preserve">  -&gt; transaction: LichHen = cancelled + slot = active</w:t>
       </w:r>
     </w:p>
     <w:p>
-      <w:r>
-        <w:rPr>
-          <w:rFonts w:ascii="Consolas" w:cs="Consolas" w:eastAsia="Consolas" w:hAnsi="Consolas"/>
-          <w:sz w:val="20"/>
-          <w:szCs w:val="20"/>
-        </w:rPr>
+      <w:pPr>
+        <w:pStyle w:val="Code"/>
+      </w:pPr>
+      <w:r>
         <w:t xml:space="preserve">  -&gt; commit thành công</w:t>
       </w:r>
     </w:p>
     <w:p>
-      <w:r>
-        <w:rPr>
-          <w:rFonts w:ascii="Consolas" w:cs="Consolas" w:eastAsia="Consolas" w:hAnsi="Consolas"/>
-          <w:sz w:val="20"/>
-          <w:szCs w:val="20"/>
-        </w:rPr>
+      <w:pPr>
+        <w:pStyle w:val="Code"/>
+      </w:pPr>
+      <w:r>
         <w:t xml:space="preserve">  -&gt; tạo audit + thông báo hủy</w:t>
       </w:r>
     </w:p>
     <w:p>
-      <w:r>
-        <w:rPr>
-          <w:rFonts w:ascii="Consolas" w:cs="Consolas" w:eastAsia="Consolas" w:hAnsi="Consolas"/>
-          <w:sz w:val="20"/>
-          <w:szCs w:val="20"/>
-        </w:rPr>
+      <w:pPr>
+        <w:pStyle w:val="Code"/>
+      </w:pPr>
+      <w:r>
         <w:t xml:space="preserve">  -&gt; API tìm slot mới nhìn thấy slot ngay ở lần tải tiếp theo</w:t>
       </w:r>
     </w:p>
@@ -2531,49 +1887,21 @@
     </w:p>
     <w:p/>
     <w:p>
-      <w:pPr>
-        <w:pStyle w:val="ListParagraph"/>
-        <w:numPr>
-          <w:ilvl w:val="0"/>
-          <w:numId w:val="1"/>
-        </w:numPr>
-      </w:pPr>
       <w:r>
         <w:t xml:space="preserve">? Hủy chỉ hợp lệ trước khi check-in. Sau check-in, lễ tân không hủy lịch; xử lý lượt trong hàng đợi bằng quyền/luồng riêng để tránh xóa dấu vết khách đã đến.</w:t>
       </w:r>
     </w:p>
     <w:p>
-      <w:pPr>
-        <w:pStyle w:val="ListParagraph"/>
-        <w:numPr>
-          <w:ilvl w:val="0"/>
-          <w:numId w:val="1"/>
-        </w:numPr>
-      </w:pPr>
       <w:r>
         <w:t xml:space="preserve">? Slot walk_in không bị biến thành slot đặt online sau khi hủy.</w:t>
       </w:r>
     </w:p>
     <w:p>
-      <w:pPr>
-        <w:pStyle w:val="ListParagraph"/>
-        <w:numPr>
-          <w:ilvl w:val="0"/>
-          <w:numId w:val="1"/>
-        </w:numPr>
-      </w:pPr>
       <w:r>
         <w:t xml:space="preserve">? Chỉ trả slot về active khi slot không bị khóa do bác sĩ nghỉ, không đang có lịch hợp lệ khác và không thuộc quá khứ.</w:t>
       </w:r>
     </w:p>
     <w:p>
-      <w:pPr>
-        <w:pStyle w:val="ListParagraph"/>
-        <w:numPr>
-          <w:ilvl w:val="0"/>
-          <w:numId w:val="1"/>
-        </w:numPr>
-      </w:pPr>
       <w:r>
         <w:t xml:space="preserve">? Nếu đã thanh toán, việc hoàn/không hoàn tiền dùng quy tắc thanh toán hiện có; không làm mất khả năng trả slot ngay.</w:t>
       </w:r>
@@ -2591,7 +1919,11 @@
       </w:r>
     </w:p>
     <w:p/>
-    <w:p/>
+    <w:p>
+      <w:r>
+        <w:t xml:space="preserve">---</w:t>
+      </w:r>
+    </w:p>
     <w:p/>
     <w:p>
       <w:pPr>
@@ -2627,49 +1959,21 @@
     </w:p>
     <w:p/>
     <w:p>
-      <w:pPr>
-        <w:pStyle w:val="ListParagraph"/>
-        <w:numPr>
-          <w:ilvl w:val="0"/>
-          <w:numId w:val="1"/>
-        </w:numPr>
-      </w:pPr>
       <w:r>
         <w:t xml:space="preserve">? Khóa cứng ngay khi bác sĩ đưa HangDoi vào trong_phong và LichHen sang in_progress.</w:t>
       </w:r>
     </w:p>
     <w:p>
-      <w:pPr>
-        <w:pStyle w:val="ListParagraph"/>
-        <w:numPr>
-          <w:ilvl w:val="0"/>
-          <w:numId w:val="1"/>
-        </w:numPr>
-      </w:pPr>
       <w:r>
         <w:t xml:space="preserve">? Lễ tân chỉ được xem và bổ sung ghi chú tiếp nhận không làm thay đổi điều trị; không đổi bác sĩ, ngày, giờ, slot, bệnh nhân, dịch vụ hoặc trạng thái thanh toán.</w:t>
       </w:r>
     </w:p>
     <w:p>
-      <w:pPr>
-        <w:pStyle w:val="ListParagraph"/>
-        <w:numPr>
-          <w:ilvl w:val="0"/>
-          <w:numId w:val="1"/>
-        </w:numPr>
-      </w:pPr>
       <w:r>
         <w:t xml:space="preserve">? Admin cũng không “sửa lịch” trực tiếp trong giai đoạn này. Nếu sai dữ liệu hành chính nghiêm trọng, tạo yêu cầu chỉnh sửa hậu kiểm sau khi khám xong, có lý do và audit.</w:t>
       </w:r>
     </w:p>
     <w:p>
-      <w:pPr>
-        <w:pStyle w:val="ListParagraph"/>
-        <w:numPr>
-          <w:ilvl w:val="0"/>
-          <w:numId w:val="1"/>
-        </w:numPr>
-      </w:pPr>
       <w:r>
         <w:t xml:space="preserve">? Khi bác sĩ hoàn tất, lịch vẫn không được dời; mọi sai sót lịch sử phải được thể hiện bằng revision/audit, không ghi đè lịch cũ.</w:t>
       </w:r>
@@ -2687,7 +1991,11 @@
       </w:r>
     </w:p>
     <w:p/>
-    <w:p/>
+    <w:p>
+      <w:r>
+        <w:t xml:space="preserve">---</w:t>
+      </w:r>
+    </w:p>
     <w:p/>
     <w:p>
       <w:pPr>
@@ -2723,32 +2031,26 @@
     </w:p>
     <w:p/>
     <w:p>
-      <w:r>
-        <w:rPr>
-          <w:rFonts w:ascii="Consolas" w:cs="Consolas" w:eastAsia="Consolas" w:hAnsi="Consolas"/>
-          <w:sz w:val="20"/>
-          <w:szCs w:val="20"/>
-        </w:rPr>
+      <w:pPr>
+        <w:pStyle w:val="Code"/>
+      </w:pPr>
+      <w:r>
         <w:t xml:space="preserve">Số thứ tự check-in (cố định)  : mã lượt khách nhận, ví dụ 17</w:t>
       </w:r>
     </w:p>
     <w:p>
-      <w:r>
-        <w:rPr>
-          <w:rFonts w:ascii="Consolas" w:cs="Consolas" w:eastAsia="Consolas" w:hAnsi="Consolas"/>
-          <w:sz w:val="20"/>
-          <w:szCs w:val="20"/>
-        </w:rPr>
+      <w:pPr>
+        <w:pStyle w:val="Code"/>
+      </w:pPr>
+      <w:r>
         <w:t xml:space="preserve">Vị trí đang chờ (động)        : thứ hạng gọi hiện tại, có thể thay đổi theo ưu tiên</w:t>
       </w:r>
     </w:p>
     <w:p>
-      <w:r>
-        <w:rPr>
-          <w:rFonts w:ascii="Consolas" w:cs="Consolas" w:eastAsia="Consolas" w:hAnsi="Consolas"/>
-          <w:sz w:val="20"/>
-          <w:szCs w:val="20"/>
-        </w:rPr>
+      <w:pPr>
+        <w:pStyle w:val="Code"/>
+      </w:pPr>
+      <w:r>
         <w:t xml:space="preserve">Slot đặt hẹn                  : giờ đã cam kết, không phải số thứ tự</w:t>
       </w:r>
     </w:p>
@@ -2760,62 +2062,50 @@
     </w:p>
     <w:p/>
     <w:p>
-      <w:r>
-        <w:rPr>
-          <w:rFonts w:ascii="Consolas" w:cs="Consolas" w:eastAsia="Consolas" w:hAnsi="Consolas"/>
-          <w:sz w:val="20"/>
-          <w:szCs w:val="20"/>
-        </w:rPr>
+      <w:pPr>
+        <w:pStyle w:val="Code"/>
+      </w:pPr>
+      <w:r>
         <w:t xml:space="preserve">Lễ tân check-in thành công</w:t>
       </w:r>
     </w:p>
     <w:p>
-      <w:r>
-        <w:rPr>
-          <w:rFonts w:ascii="Consolas" w:cs="Consolas" w:eastAsia="Consolas" w:hAnsi="Consolas"/>
-          <w:sz w:val="20"/>
-          <w:szCs w:val="20"/>
-        </w:rPr>
+      <w:pPr>
+        <w:pStyle w:val="Code"/>
+      </w:pPr>
+      <w:r>
         <w:t xml:space="preserve">  -&gt; transaction giữ/tạo HangDoi</w:t>
       </w:r>
     </w:p>
     <w:p>
-      <w:r>
-        <w:rPr>
-          <w:rFonts w:ascii="Consolas" w:cs="Consolas" w:eastAsia="Consolas" w:hAnsi="Consolas"/>
-          <w:sz w:val="20"/>
-          <w:szCs w:val="20"/>
-        </w:rPr>
+      <w:pPr>
+        <w:pStyle w:val="Code"/>
+      </w:pPr>
+      <w:r>
         <w:t xml:space="preserve">  -&gt; atomic increment bộ đếm của ca/bác sĩ/ngày</w:t>
       </w:r>
     </w:p>
     <w:p>
-      <w:r>
-        <w:rPr>
-          <w:rFonts w:ascii="Consolas" w:cs="Consolas" w:eastAsia="Consolas" w:hAnsi="Consolas"/>
-          <w:sz w:val="20"/>
-          <w:szCs w:val="20"/>
-        </w:rPr>
+      <w:pPr>
+        <w:pStyle w:val="Code"/>
+      </w:pPr>
+      <w:r>
         <w:t xml:space="preserve">  -&gt; gán so_thu_tu_checkin cho HangDoi</w:t>
       </w:r>
     </w:p>
     <w:p>
-      <w:r>
-        <w:rPr>
-          <w:rFonts w:ascii="Consolas" w:cs="Consolas" w:eastAsia="Consolas" w:hAnsi="Consolas"/>
-          <w:sz w:val="20"/>
-          <w:szCs w:val="20"/>
-        </w:rPr>
+      <w:pPr>
+        <w:pStyle w:val="Code"/>
+      </w:pPr>
+      <w:r>
         <w:t xml:space="preserve">  -&gt; trả số cho màn hình/in phiếu</w:t>
       </w:r>
     </w:p>
     <w:p>
-      <w:r>
-        <w:rPr>
-          <w:rFonts w:ascii="Consolas" w:cs="Consolas" w:eastAsia="Consolas" w:hAnsi="Consolas"/>
-          <w:sz w:val="20"/>
-          <w:szCs w:val="20"/>
-        </w:rPr>
+      <w:pPr>
+        <w:pStyle w:val="Code"/>
+      </w:pPr>
+      <w:r>
         <w:t xml:space="preserve">  -&gt; API hàng đợi trả cả số cố định và vị trí động</w:t>
       </w:r>
     </w:p>
@@ -2838,7 +2128,11 @@
       </w:r>
     </w:p>
     <w:p/>
-    <w:p/>
+    <w:p>
+      <w:r>
+        <w:t xml:space="preserve">---</w:t>
+      </w:r>
+    </w:p>
     <w:p/>
     <w:p>
       <w:pPr>
@@ -2868,49 +2162,21 @@
     </w:p>
     <w:p/>
     <w:p>
-      <w:pPr>
-        <w:pStyle w:val="ListParagraph"/>
-        <w:numPr>
-          <w:ilvl w:val="0"/>
-          <w:numId w:val="1"/>
-        </w:numPr>
-      </w:pPr>
       <w:r>
         <w:t xml:space="preserve">? Một số điện thoại là thông tin liên hệ, có thể gắn với nhiều hồ sơ bệnh nhân.</w:t>
       </w:r>
     </w:p>
     <w:p>
-      <w:pPr>
-        <w:pStyle w:val="ListParagraph"/>
-        <w:numPr>
-          <w:ilvl w:val="0"/>
-          <w:numId w:val="1"/>
-        </w:numPr>
-      </w:pPr>
       <w:r>
         <w:t xml:space="preserve">? Cùng số điện thoại được đặt nhiều slot trong một ngày nếu đó là các hồ sơ bệnh nhân khác nhau, hoặc cùng người có nhiều dịch vụ không trùng thời điểm và được phòng khám cho phép.</w:t>
       </w:r>
     </w:p>
     <w:p>
-      <w:pPr>
-        <w:pStyle w:val="ListParagraph"/>
-        <w:numPr>
-          <w:ilvl w:val="0"/>
-          <w:numId w:val="1"/>
-        </w:numPr>
-      </w:pPr>
       <w:r>
         <w:t xml:space="preserve">? Chặn một hồ sơ bệnh nhân có hai lịch còn hiệu lực tại cùng thời điểm. Với cùng ngày, cảnh báo nếu đặt nhiều lịch để lễ tân kiểm tra, nhưng không chặn cứng trường hợp có căn cứ.</w:t>
       </w:r>
     </w:p>
     <w:p>
-      <w:pPr>
-        <w:pStyle w:val="ListParagraph"/>
-        <w:numPr>
-          <w:ilvl w:val="0"/>
-          <w:numId w:val="1"/>
-        </w:numPr>
-      </w:pPr>
       <w:r>
         <w:t xml:space="preserve">? Không dựa vào tên hoặc số điện thoại để nhận diện duy nhất; dùng ho_so_benh_nhan_id/member_id.</w:t>
       </w:r>
@@ -2934,7 +2200,11 @@
       </w:r>
     </w:p>
     <w:p/>
-    <w:p/>
+    <w:p>
+      <w:r>
+        <w:t xml:space="preserve">---</w:t>
+      </w:r>
+    </w:p>
     <w:p/>
     <w:p>
       <w:pPr>
@@ -2970,72 +2240,58 @@
     </w:p>
     <w:p/>
     <w:p>
-      <w:r>
-        <w:rPr>
-          <w:rFonts w:ascii="Consolas" w:cs="Consolas" w:eastAsia="Consolas" w:hAnsi="Consolas"/>
-          <w:sz w:val="20"/>
-          <w:szCs w:val="20"/>
-        </w:rPr>
+      <w:pPr>
+        <w:pStyle w:val="Code"/>
+      </w:pPr>
+      <w:r>
         <w:t xml:space="preserve">Thao tác thay đổi lịch được validate</w:t>
       </w:r>
     </w:p>
     <w:p>
-      <w:r>
-        <w:rPr>
-          <w:rFonts w:ascii="Consolas" w:cs="Consolas" w:eastAsia="Consolas" w:hAnsi="Consolas"/>
-          <w:sz w:val="20"/>
-          <w:szCs w:val="20"/>
-        </w:rPr>
+      <w:pPr>
+        <w:pStyle w:val="Code"/>
+      </w:pPr>
+      <w:r>
         <w:t xml:space="preserve">  -&gt; transaction cập nhật lịch + lịch sử nghiệp vụ</w:t>
       </w:r>
     </w:p>
     <w:p>
-      <w:r>
-        <w:rPr>
-          <w:rFonts w:ascii="Consolas" w:cs="Consolas" w:eastAsia="Consolas" w:hAnsi="Consolas"/>
-          <w:sz w:val="20"/>
-          <w:szCs w:val="20"/>
-        </w:rPr>
+      <w:pPr>
+        <w:pStyle w:val="Code"/>
+      </w:pPr>
+      <w:r>
         <w:t xml:space="preserve">  -&gt; tạo notification outbox trong cùng transaction</w:t>
       </w:r>
     </w:p>
     <w:p>
-      <w:r>
-        <w:rPr>
-          <w:rFonts w:ascii="Consolas" w:cs="Consolas" w:eastAsia="Consolas" w:hAnsi="Consolas"/>
-          <w:sz w:val="20"/>
-          <w:szCs w:val="20"/>
-        </w:rPr>
+      <w:pPr>
+        <w:pStyle w:val="Code"/>
+      </w:pPr>
+      <w:r>
         <w:t xml:space="preserve">  -&gt; commit</w:t>
       </w:r>
     </w:p>
     <w:p>
-      <w:r>
-        <w:rPr>
-          <w:rFonts w:ascii="Consolas" w:cs="Consolas" w:eastAsia="Consolas" w:hAnsi="Consolas"/>
-          <w:sz w:val="20"/>
-          <w:szCs w:val="20"/>
-        </w:rPr>
+      <w:pPr>
+        <w:pStyle w:val="Code"/>
+      </w:pPr>
+      <w:r>
         <w:t xml:space="preserve">  -&gt; worker/service gửi theo kênh khả dụng</w:t>
       </w:r>
     </w:p>
     <w:p>
-      <w:r>
-        <w:rPr>
-          <w:rFonts w:ascii="Consolas" w:cs="Consolas" w:eastAsia="Consolas" w:hAnsi="Consolas"/>
-          <w:sz w:val="20"/>
-          <w:szCs w:val="20"/>
-        </w:rPr>
+      <w:pPr>
+        <w:pStyle w:val="Code"/>
+      </w:pPr>
+      <w:r>
         <w:t xml:space="preserve">  -&gt; ghi sent / failed / can_goi_thu_cong</w:t>
       </w:r>
     </w:p>
     <w:p>
-      <w:r>
-        <w:rPr>
-          <w:rFonts w:ascii="Consolas" w:cs="Consolas" w:eastAsia="Consolas" w:hAnsi="Consolas"/>
-          <w:sz w:val="20"/>
-          <w:szCs w:val="20"/>
-        </w:rPr>
+      <w:pPr>
+        <w:pStyle w:val="Code"/>
+      </w:pPr>
+      <w:r>
         <w:t xml:space="preserve">  -&gt; lễ tân xem và xử lý các bản ghi chưa thông báo được</w:t>
       </w:r>
     </w:p>
@@ -3064,7 +2320,11 @@
       </w:r>
     </w:p>
     <w:p/>
-    <w:p/>
+    <w:p>
+      <w:r>
+        <w:t xml:space="preserve">---</w:t>
+      </w:r>
+    </w:p>
     <w:p/>
     <w:p>
       <w:pPr>
@@ -3101,71 +2361,36 @@
     <w:p/>
     <w:p>
       <w:r>
-        <w:rPr>
-          <w:rFonts w:ascii="Consolas" w:cs="Consolas" w:eastAsia="Consolas" w:hAnsi="Consolas"/>
-          <w:sz w:val="18"/>
-          <w:szCs w:val="18"/>
-        </w:rPr>
         <w:t xml:space="preserve">| Nhóm dữ liệu | Phải lưu |</w:t>
       </w:r>
     </w:p>
     <w:p>
       <w:r>
-        <w:rPr>
-          <w:rFonts w:ascii="Consolas" w:cs="Consolas" w:eastAsia="Consolas" w:hAnsi="Consolas"/>
-          <w:sz w:val="18"/>
-          <w:szCs w:val="18"/>
-        </w:rPr>
         <w:t xml:space="preserve">|---|---|</w:t>
       </w:r>
     </w:p>
     <w:p>
       <w:r>
-        <w:rPr>
-          <w:rFonts w:ascii="Consolas" w:cs="Consolas" w:eastAsia="Consolas" w:hAnsi="Consolas"/>
-          <w:sz w:val="18"/>
-          <w:szCs w:val="18"/>
-        </w:rPr>
         <w:t xml:space="preserve">| Actor | nguoi_thuc_hien_id, vai trò thật là receptionist, kênh web/quầy |</w:t>
       </w:r>
     </w:p>
     <w:p>
       <w:r>
-        <w:rPr>
-          <w:rFonts w:ascii="Consolas" w:cs="Consolas" w:eastAsia="Consolas" w:hAnsi="Consolas"/>
-          <w:sz w:val="18"/>
-          <w:szCs w:val="18"/>
-        </w:rPr>
         <w:t xml:space="preserve">| Trước/sau | bác sĩ, ngày, giờ, schedule, slot, trạng thái và thanh toán nếu có thay đổi |</w:t>
       </w:r>
     </w:p>
     <w:p>
       <w:r>
-        <w:rPr>
-          <w:rFonts w:ascii="Consolas" w:cs="Consolas" w:eastAsia="Consolas" w:hAnsi="Consolas"/>
-          <w:sz w:val="18"/>
-          <w:szCs w:val="18"/>
-        </w:rPr>
         <w:t xml:space="preserve">| Nguyên nhân | khach_yeu_cau, phong_kham, bac_si_nghi_dot_xuat, khach_den_tre, qua_tai_ca và mô tả tự do |</w:t>
       </w:r>
     </w:p>
     <w:p>
       <w:r>
-        <w:rPr>
-          <w:rFonts w:ascii="Consolas" w:cs="Consolas" w:eastAsia="Consolas" w:hAnsi="Consolas"/>
-          <w:sz w:val="18"/>
-          <w:szCs w:val="18"/>
-        </w:rPr>
         <w:t xml:space="preserve">| Bằng chứng liên lạc | notification id, trạng thái gửi/gọi, lựa chọn của khách |</w:t>
       </w:r>
     </w:p>
     <w:p>
       <w:r>
-        <w:rPr>
-          <w:rFonts w:ascii="Consolas" w:cs="Consolas" w:eastAsia="Consolas" w:hAnsi="Consolas"/>
-          <w:sz w:val="18"/>
-          <w:szCs w:val="18"/>
-        </w:rPr>
         <w:t xml:space="preserve">| Thời điểm | lúc tạo đề xuất, lúc khách chọn, lúc áp dụng |</w:t>
       </w:r>
     </w:p>
@@ -3188,7 +2413,11 @@
       </w:r>
     </w:p>
     <w:p/>
-    <w:p/>
+    <w:p>
+      <w:r>
+        <w:t xml:space="preserve">---</w:t>
+      </w:r>
+    </w:p>
     <w:p/>
     <w:p>
       <w:pPr>
@@ -3224,72 +2453,58 @@
     </w:p>
     <w:p/>
     <w:p>
-      <w:r>
-        <w:rPr>
-          <w:rFonts w:ascii="Consolas" w:cs="Consolas" w:eastAsia="Consolas" w:hAnsi="Consolas"/>
-          <w:sz w:val="20"/>
-          <w:szCs w:val="20"/>
-        </w:rPr>
+      <w:pPr>
+        <w:pStyle w:val="Code"/>
+      </w:pPr>
+      <w:r>
         <w:t xml:space="preserve">Lễ tân mở hồ sơ cũ</w:t>
       </w:r>
     </w:p>
     <w:p>
-      <w:r>
-        <w:rPr>
-          <w:rFonts w:ascii="Consolas" w:cs="Consolas" w:eastAsia="Consolas" w:hAnsi="Consolas"/>
-          <w:sz w:val="20"/>
-          <w:szCs w:val="20"/>
-        </w:rPr>
+      <w:pPr>
+        <w:pStyle w:val="Code"/>
+      </w:pPr>
+      <w:r>
         <w:t xml:space="preserve">  -&gt; chọn Chỉnh sửa thông tin hành chính</w:t>
       </w:r>
     </w:p>
     <w:p>
-      <w:r>
-        <w:rPr>
-          <w:rFonts w:ascii="Consolas" w:cs="Consolas" w:eastAsia="Consolas" w:hAnsi="Consolas"/>
-          <w:sz w:val="20"/>
-          <w:szCs w:val="20"/>
-        </w:rPr>
+      <w:pPr>
+        <w:pStyle w:val="Code"/>
+      </w:pPr>
+      <w:r>
         <w:t xml:space="preserve">  -&gt; backend yêu cầu lý do</w:t>
       </w:r>
     </w:p>
     <w:p>
-      <w:r>
-        <w:rPr>
-          <w:rFonts w:ascii="Consolas" w:cs="Consolas" w:eastAsia="Consolas" w:hAnsi="Consolas"/>
-          <w:sz w:val="20"/>
-          <w:szCs w:val="20"/>
-        </w:rPr>
+      <w:pPr>
+        <w:pStyle w:val="Code"/>
+      </w:pPr>
+      <w:r>
         <w:t xml:space="preserve">  -&gt; kiểm tra xung đột nhận diện cơ bản</w:t>
       </w:r>
     </w:p>
     <w:p>
-      <w:r>
-        <w:rPr>
-          <w:rFonts w:ascii="Consolas" w:cs="Consolas" w:eastAsia="Consolas" w:hAnsi="Consolas"/>
-          <w:sz w:val="20"/>
-          <w:szCs w:val="20"/>
-        </w:rPr>
+      <w:pPr>
+        <w:pStyle w:val="Code"/>
+      </w:pPr>
+      <w:r>
         <w:t xml:space="preserve">  -&gt; cập nhật hồ sơ hiện tại</w:t>
       </w:r>
     </w:p>
     <w:p>
-      <w:r>
-        <w:rPr>
-          <w:rFonts w:ascii="Consolas" w:cs="Consolas" w:eastAsia="Consolas" w:hAnsi="Consolas"/>
-          <w:sz w:val="20"/>
-          <w:szCs w:val="20"/>
-        </w:rPr>
+      <w:pPr>
+        <w:pStyle w:val="Code"/>
+      </w:pPr>
+      <w:r>
         <w:t xml:space="preserve">  -&gt; ghi NhatKyThaoTac: trước/sau, trường đổi, lý do, actor, thời điểm</w:t>
       </w:r>
     </w:p>
     <w:p>
-      <w:r>
-        <w:rPr>
-          <w:rFonts w:ascii="Consolas" w:cs="Consolas" w:eastAsia="Consolas" w:hAnsi="Consolas"/>
-          <w:sz w:val="20"/>
-          <w:szCs w:val="20"/>
-        </w:rPr>
+      <w:pPr>
+        <w:pStyle w:val="Code"/>
+      </w:pPr>
+      <w:r>
         <w:t xml:space="preserve">  -&gt; không sửa snapshot thông tin đã dùng trong hồ sơ khám cũ</w:t>
       </w:r>
     </w:p>
@@ -3306,7 +2521,11 @@
       </w:r>
     </w:p>
     <w:p/>
-    <w:p/>
+    <w:p>
+      <w:r>
+        <w:t xml:space="preserve">---</w:t>
+      </w:r>
+    </w:p>
     <w:p/>
     <w:p>
       <w:pPr>
@@ -3336,49 +2555,21 @@
     </w:p>
     <w:p/>
     <w:p>
-      <w:pPr>
-        <w:pStyle w:val="ListParagraph"/>
-        <w:numPr>
-          <w:ilvl w:val="0"/>
-          <w:numId w:val="1"/>
-        </w:numPr>
-      </w:pPr>
       <w:r>
         <w:t xml:space="preserve">? Lễ tân chỉ được tạo yêu cầu chỉnh sửa bệnh án, nêu rõ lỗi hành chính/thiếu thông tin và đính kèm lý do.</w:t>
       </w:r>
     </w:p>
     <w:p>
-      <w:pPr>
-        <w:pStyle w:val="ListParagraph"/>
-        <w:numPr>
-          <w:ilvl w:val="0"/>
-          <w:numId w:val="1"/>
-        </w:numPr>
-      </w:pPr>
       <w:r>
         <w:t xml:space="preserve">? Bác sĩ phụ trách là người sửa/xác nhận nội dung chuyên môn.</w:t>
       </w:r>
     </w:p>
     <w:p>
-      <w:pPr>
-        <w:pStyle w:val="ListParagraph"/>
-        <w:numPr>
-          <w:ilvl w:val="0"/>
-          <w:numId w:val="1"/>
-        </w:numPr>
-      </w:pPr>
       <w:r>
         <w:t xml:space="preserve">? Admin chỉ được sửa trực tiếp trong chế độ ngoại lệ: quyền riêng, lý do bắt buộc, ghi rõ “admin override”, không xóa revision cũ.</w:t>
       </w:r>
     </w:p>
     <w:p>
-      <w:pPr>
-        <w:pStyle w:val="ListParagraph"/>
-        <w:numPr>
-          <w:ilvl w:val="0"/>
-          <w:numId w:val="1"/>
-        </w:numPr>
-      </w:pPr>
       <w:r>
         <w:t xml:space="preserve">? Với thay đổi sau khi bệnh án đã xác nhận, tạo revision mới hoặc lưu snapshot trước/sau; không cập nhật im lặng vào bản ghi đã ký xác nhận.</w:t>
       </w:r>
@@ -3402,7 +2593,11 @@
       </w:r>
     </w:p>
     <w:p/>
-    <w:p/>
+    <w:p>
+      <w:r>
+        <w:t xml:space="preserve">---</w:t>
+      </w:r>
+    </w:p>
     <w:p/>
     <w:p>
       <w:pPr>
@@ -3439,71 +2634,36 @@
     <w:p/>
     <w:p>
       <w:r>
-        <w:rPr>
-          <w:rFonts w:ascii="Consolas" w:cs="Consolas" w:eastAsia="Consolas" w:hAnsi="Consolas"/>
-          <w:sz w:val="18"/>
-          <w:szCs w:val="18"/>
-        </w:rPr>
         <w:t xml:space="preserve">| Hiển thị | Điều kiện | Tác động tại quầy |</w:t>
       </w:r>
     </w:p>
     <w:p>
       <w:r>
-        <w:rPr>
-          <w:rFonts w:ascii="Consolas" w:cs="Consolas" w:eastAsia="Consolas" w:hAnsi="Consolas"/>
-          <w:sz w:val="18"/>
-          <w:szCs w:val="18"/>
-        </w:rPr>
         <w:t xml:space="preserve">|---|---|---|</w:t>
       </w:r>
     </w:p>
     <w:p>
       <w:r>
-        <w:rPr>
-          <w:rFonts w:ascii="Consolas" w:cs="Consolas" w:eastAsia="Consolas" w:hAnsi="Consolas"/>
-          <w:sz w:val="18"/>
-          <w:szCs w:val="18"/>
-        </w:rPr>
         <w:t xml:space="preserve">| Sẵn sàng | không có lượt trong_phong, còn năng lực | nhận/check-in bình thường |</w:t>
       </w:r>
     </w:p>
     <w:p>
       <w:r>
-        <w:rPr>
-          <w:rFonts w:ascii="Consolas" w:cs="Consolas" w:eastAsia="Consolas" w:hAnsi="Consolas"/>
-          <w:sz w:val="18"/>
-          <w:szCs w:val="18"/>
-        </w:rPr>
         <w:t xml:space="preserve">| Đang khám | có một lượt trong_phong | vẫn check-in, hiển thị thời gian chờ |</w:t>
       </w:r>
     </w:p>
     <w:p>
       <w:r>
-        <w:rPr>
-          <w:rFonts w:ascii="Consolas" w:cs="Consolas" w:eastAsia="Consolas" w:hAnsi="Consolas"/>
-          <w:sz w:val="18"/>
-          <w:szCs w:val="18"/>
-        </w:rPr>
         <w:t xml:space="preserve">| Quá tải tạm thời | lượt đang khám vượt ngưỡng hoặc hàng đợi quá dài | cảnh báo khách, ưu tiên slot chờ/dời |</w:t>
       </w:r>
     </w:p>
     <w:p>
       <w:r>
-        <w:rPr>
-          <w:rFonts w:ascii="Consolas" w:cs="Consolas" w:eastAsia="Consolas" w:hAnsi="Consolas"/>
-          <w:sz w:val="18"/>
-          <w:szCs w:val="18"/>
-        </w:rPr>
         <w:t xml:space="preserve">| Tạm dừng tiếp nhận | lễ tân/admin bật theo ca | không nhận lượt tại quầy mới, vẫn xử lý khách đã có lịch |</w:t>
       </w:r>
     </w:p>
     <w:p>
       <w:r>
-        <w:rPr>
-          <w:rFonts w:ascii="Consolas" w:cs="Consolas" w:eastAsia="Consolas" w:hAnsi="Consolas"/>
-          <w:sz w:val="18"/>
-          <w:szCs w:val="18"/>
-        </w:rPr>
         <w:t xml:space="preserve">| Nghỉ đột xuất | sự cố đã xác nhận | chạy LT-01 |</w:t>
       </w:r>
     </w:p>
@@ -3531,151 +2691,76 @@
     <w:p/>
     <w:p>
       <w:r>
-        <w:rPr>
-          <w:rFonts w:ascii="Consolas" w:cs="Consolas" w:eastAsia="Consolas" w:hAnsi="Consolas"/>
-          <w:sz w:val="18"/>
-          <w:szCs w:val="18"/>
-        </w:rPr>
         <w:t xml:space="preserve">| Thứ tự | Task | Mục tiêu bàn giao |</w:t>
       </w:r>
     </w:p>
     <w:p>
       <w:r>
-        <w:rPr>
-          <w:rFonts w:ascii="Consolas" w:cs="Consolas" w:eastAsia="Consolas" w:hAnsi="Consolas"/>
-          <w:sz w:val="18"/>
-          <w:szCs w:val="18"/>
-        </w:rPr>
         <w:t xml:space="preserve">|---:|---|---|</w:t>
       </w:r>
     </w:p>
     <w:p>
       <w:r>
-        <w:rPr>
-          <w:rFonts w:ascii="Consolas" w:cs="Consolas" w:eastAsia="Consolas" w:hAnsi="Consolas"/>
-          <w:sz w:val="18"/>
-          <w:szCs w:val="18"/>
-        </w:rPr>
         <w:t xml:space="preserve">| 1 | LT-00 | Contract trạng thái, quyền và action khả dụng |</w:t>
       </w:r>
     </w:p>
     <w:p>
       <w:r>
-        <w:rPr>
-          <w:rFonts w:ascii="Consolas" w:cs="Consolas" w:eastAsia="Consolas" w:hAnsi="Consolas"/>
-          <w:sz w:val="18"/>
-          <w:szCs w:val="18"/>
-        </w:rPr>
         <w:t xml:space="preserve">| 2 | LT-09 | Audit đúng vai trò lễ tân và dữ liệu trước/sau |</w:t>
       </w:r>
     </w:p>
     <w:p>
       <w:r>
-        <w:rPr>
-          <w:rFonts w:ascii="Consolas" w:cs="Consolas" w:eastAsia="Consolas" w:hAnsi="Consolas"/>
-          <w:sz w:val="18"/>
-          <w:szCs w:val="18"/>
-        </w:rPr>
         <w:t xml:space="preserve">| 3 | LT-08 | Notification outbox và danh sách cần gọi thủ công |</w:t>
       </w:r>
     </w:p>
     <w:p>
       <w:r>
-        <w:rPr>
-          <w:rFonts w:ascii="Consolas" w:cs="Consolas" w:eastAsia="Consolas" w:hAnsi="Consolas"/>
-          <w:sz w:val="18"/>
-          <w:szCs w:val="18"/>
-        </w:rPr>
         <w:t xml:space="preserve">| 4 | LT-04 | Hủy lịch trả slot đúng và đồng bộ availability |</w:t>
       </w:r>
     </w:p>
     <w:p>
       <w:r>
-        <w:rPr>
-          <w:rFonts w:ascii="Consolas" w:cs="Consolas" w:eastAsia="Consolas" w:hAnsi="Consolas"/>
-          <w:sz w:val="18"/>
-          <w:szCs w:val="18"/>
-        </w:rPr>
         <w:t xml:space="preserve">| 5 | LT-05 | Chặn toàn bộ chỉnh sửa khi bệnh nhân đang khám |</w:t>
       </w:r>
     </w:p>
     <w:p>
       <w:r>
-        <w:rPr>
-          <w:rFonts w:ascii="Consolas" w:cs="Consolas" w:eastAsia="Consolas" w:hAnsi="Consolas"/>
-          <w:sz w:val="18"/>
-          <w:szCs w:val="18"/>
-        </w:rPr>
         <w:t xml:space="preserve">| 6 | LT-06 | Số thứ tự check-in cố định, không trùng |</w:t>
       </w:r>
     </w:p>
     <w:p>
       <w:r>
-        <w:rPr>
-          <w:rFonts w:ascii="Consolas" w:cs="Consolas" w:eastAsia="Consolas" w:hAnsi="Consolas"/>
-          <w:sz w:val="18"/>
-          <w:szCs w:val="18"/>
-        </w:rPr>
         <w:t xml:space="preserve">| 7 | LT-12 | Trạng thái vận hành bác sĩ cho dashboard lễ tân |</w:t>
       </w:r>
     </w:p>
     <w:p>
       <w:r>
-        <w:rPr>
-          <w:rFonts w:ascii="Consolas" w:cs="Consolas" w:eastAsia="Consolas" w:hAnsi="Consolas"/>
-          <w:sz w:val="18"/>
-          <w:szCs w:val="18"/>
-        </w:rPr>
         <w:t xml:space="preserve">| 8 | LT-02 | Xử lý khách đến muộn theo ba phương án rõ ràng |</w:t>
       </w:r>
     </w:p>
     <w:p>
       <w:r>
-        <w:rPr>
-          <w:rFonts w:ascii="Consolas" w:cs="Consolas" w:eastAsia="Consolas" w:hAnsi="Consolas"/>
-          <w:sz w:val="18"/>
-          <w:szCs w:val="18"/>
-        </w:rPr>
         <w:t xml:space="preserve">| 9 | LT-03 | Quá tải do khám kéo dài và slot chờ |</w:t>
       </w:r>
     </w:p>
     <w:p>
       <w:r>
-        <w:rPr>
-          <w:rFonts w:ascii="Consolas" w:cs="Consolas" w:eastAsia="Consolas" w:hAnsi="Consolas"/>
-          <w:sz w:val="18"/>
-          <w:szCs w:val="18"/>
-        </w:rPr>
         <w:t xml:space="preserve">| 10 | LT-01 | Điều phối bác sĩ nghỉ đột xuất/chuyển bác sĩ |</w:t>
       </w:r>
     </w:p>
     <w:p>
       <w:r>
-        <w:rPr>
-          <w:rFonts w:ascii="Consolas" w:cs="Consolas" w:eastAsia="Consolas" w:hAnsi="Consolas"/>
-          <w:sz w:val="18"/>
-          <w:szCs w:val="18"/>
-        </w:rPr>
         <w:t xml:space="preserve">| 11 | LT-07 | Nhiều hồ sơ dùng chung số điện thoại |</w:t>
       </w:r>
     </w:p>
     <w:p>
       <w:r>
-        <w:rPr>
-          <w:rFonts w:ascii="Consolas" w:cs="Consolas" w:eastAsia="Consolas" w:hAnsi="Consolas"/>
-          <w:sz w:val="18"/>
-          <w:szCs w:val="18"/>
-        </w:rPr>
         <w:t xml:space="preserve">| 12 | LT-10 | Sửa thông tin hành chính bệnh nhân có audit |</w:t>
       </w:r>
     </w:p>
     <w:p>
       <w:r>
-        <w:rPr>
-          <w:rFonts w:ascii="Consolas" w:cs="Consolas" w:eastAsia="Consolas" w:hAnsi="Consolas"/>
-          <w:sz w:val="18"/>
-          <w:szCs w:val="18"/>
-        </w:rPr>
         <w:t xml:space="preserve">| 13 | LT-11 | Workflow yêu cầu/revision bệnh án |</w:t>
       </w:r>
     </w:p>
@@ -3786,73 +2871,31 @@
     </w:p>
     <w:p/>
     <w:p>
-      <w:pPr>
-        <w:pStyle w:val="ListParagraph"/>
-        <w:numPr>
-          <w:ilvl w:val="0"/>
-          <w:numId w:val="1"/>
-        </w:numPr>
-      </w:pPr>
       <w:r>
         <w:t xml:space="preserve">? HangDoi đã là nguồn sự thật cho lượt khám thực tế và đã có trạng thái dang_cho, da_goi, trong_phong, cho_dich_vu, hoan_thanh.</w:t>
       </w:r>
     </w:p>
     <w:p>
-      <w:pPr>
-        <w:pStyle w:val="ListParagraph"/>
-        <w:numPr>
-          <w:ilvl w:val="0"/>
-          <w:numId w:val="1"/>
-        </w:numPr>
-      </w:pPr>
       <w:r>
         <w:t xml:space="preserve">? Check-in lịch hẹn đã chạy theo transaction LichHen + HangDoi; đây là nền tốt cho LT-02 và LT-06.</w:t>
       </w:r>
     </w:p>
     <w:p>
-      <w:pPr>
-        <w:pStyle w:val="ListParagraph"/>
-        <w:numPr>
-          <w:ilvl w:val="0"/>
-          <w:numId w:val="1"/>
-        </w:numPr>
-      </w:pPr>
       <w:r>
         <w:t xml:space="preserve">? Dời lịch đã dùng chung apDungPhuongAn() và đã có de_xuat_doi trên lịch hẹn; LT-01 nên mở rộng đúng điểm này.</w:t>
       </w:r>
     </w:p>
     <w:p>
-      <w:pPr>
-        <w:pStyle w:val="ListParagraph"/>
-        <w:numPr>
-          <w:ilvl w:val="0"/>
-          <w:numId w:val="1"/>
-        </w:numPr>
-      </w:pPr>
       <w:r>
         <w:t xml:space="preserve">? Hủy lịch lễ tân hiện đã dùng chung releaseAppointmentSlot(), có audit/notification theo LT-04 và slot được mở lại sạch sau commit.</w:t>
       </w:r>
     </w:p>
     <w:p>
-      <w:pPr>
-        <w:pStyle w:val="ListParagraph"/>
-        <w:numPr>
-          <w:ilvl w:val="0"/>
-          <w:numId w:val="1"/>
-        </w:numPr>
-      </w:pPr>
       <w:r>
         <w:t xml:space="preserve">? LichSuLichHen trước đây thiếu enum receptionist; phần enum nền đã được xử lý trong LT-00, còn LT-09 tiếp tục chuẩn hóa đầy đủ nội dung history trước/sau cho các thao tác dời lịch/chuyển bác sĩ/hủy lịch.</w:t>
       </w:r>
     </w:p>
     <w:p>
-      <w:pPr>
-        <w:pStyle w:val="ListParagraph"/>
-        <w:numPr>
-          <w:ilvl w:val="0"/>
-          <w:numId w:val="1"/>
-        </w:numPr>
-      </w:pPr>
       <w:r>
         <w:t xml:space="preserve">? Hệ thống chưa lưu số thứ tự check-in cố định; đây là phần bổ sung dữ liệu nhỏ nhưng cần transaction/index ở LT-06.</w:t>
       </w:r>
@@ -3863,291 +2906,56 @@
         <w:t xml:space="preserve">Tài liệu liên quan đã tham chiếu khi lập kế hoạch: docs/Hoan thien luong dat lich - tu khach den bac si tiep nhan (2026-07-26).md, docs/Ke hoach hoan thien luong check-in-den-hoa-don (2026-07-29).md, docs/2026-07-28-le-tan-dat-lich-offline-design.md.</w:t>
       </w:r>
     </w:p>
-    <w:p/>
     <w:sectPr>
-      <w:pgSz w:w="11906" w:h="16838" w:orient="portrait"/>
-      <w:pgMar w:top="1440" w:right="1440" w:bottom="1440" w:left="1440" w:header="708" w:footer="708" w:gutter="0"/>
-      <w:pgNumType/>
-      <w:docGrid w:linePitch="360"/>
+      <w:pgSz w:w="11906" w:h="16838"/>
+      <w:pgMar w:top="1440" w:right="1440" w:bottom="1440" w:left="1440"/>
     </w:sectPr>
   </w:body>
 </w:document>
 </file>
 
-<file path=word/comments.xml><?xml version="1.0" encoding="utf-8"?>
-<w:comments xmlns:cx="http://schemas.microsoft.com/office/drawing/2014/chartex" xmlns:cx1="http://schemas.microsoft.com/office/drawing/2015/9/8/chartex" xmlns:cx2="http://schemas.microsoft.com/office/drawing/2015/10/21/chartex" xmlns:cx3="http://schemas.microsoft.com/office/drawing/2016/5/9/chartex" xmlns:cx4="http://schemas.microsoft.com/office/drawing/2016/5/10/chartex" xmlns:cx5="http://schemas.microsoft.com/office/drawing/2016/5/11/chartex" xmlns:cx6="http://schemas.microsoft.com/office/drawing/2016/5/12/chartex" xmlns:cx7="http://schemas.microsoft.com/office/drawing/2016/5/13/chartex" xmlns:cx8="http://schemas.microsoft.com/office/drawing/2016/5/14/chartex" xmlns:mc="http://schemas.openxmlformats.org/markup-compatibility/2006" xmlns:aink="http://schemas.microsoft.com/office/drawing/2016/ink" xmlns:am3d="http://schemas.microsoft.com/office/drawing/2017/model3d" xmlns:o="urn:schemas-microsoft-com:office:office" xmlns:r="http://schemas.openxmlformats.org/officeDocument/2006/relationships" xmlns:m="http://schemas.openxmlformats.org/officeDocument/2006/math" xmlns:v="urn:schemas-microsoft-com:vml" xmlns:wp14="http://schemas.microsoft.com/office/word/2010/wordprocessingDrawing" xmlns:wp="http://schemas.openxmlformats.org/drawingml/2006/wordprocessingDrawing" xmlns:w10="urn:schemas-microsoft-com:office:word" xmlns:w="http://schemas.openxmlformats.org/wordprocessingml/2006/main" xmlns:w14="http://schemas.microsoft.com/office/word/2010/wordml" xmlns:w15="http://schemas.microsoft.com/office/word/2012/wordml" xmlns:w16cex="http://schemas.microsoft.com/office/word/2018/wordml/cex" xmlns:w16cid="http://schemas.microsoft.com/office/word/2016/wordml/cid" xmlns:w16="http://schemas.microsoft.com/office/word/2018/wordml" xmlns:w16sdtdh="http://schemas.microsoft.com/office/word/2020/wordml/sdtdatahash" xmlns:w16se="http://schemas.microsoft.com/office/word/2015/wordml/symex" xmlns:wpg="http://schemas.microsoft.com/office/word/2010/wordprocessingGroup" xmlns:wpi="http://schemas.microsoft.com/office/word/2010/wordprocessingInk" xmlns:wne="http://schemas.microsoft.com/office/word/2006/wordml" xmlns:wps="http://schemas.microsoft.com/office/word/2010/wordprocessingShape"/>
-</file>
-
-<file path=word/footnotes.xml><?xml version="1.0" encoding="utf-8"?>
-<w:footnotes xmlns:wpc="http://schemas.microsoft.com/office/word/2010/wordprocessingCanvas" xmlns:mc="http://schemas.openxmlformats.org/markup-compatibility/2006" xmlns:o="urn:schemas-microsoft-com:office:office" xmlns:r="http://schemas.openxmlformats.org/officeDocument/2006/relationships" xmlns:m="http://schemas.openxmlformats.org/officeDocument/2006/math" xmlns:v="urn:schemas-microsoft-com:vml" xmlns:wp14="http://schemas.microsoft.com/office/word/2010/wordprocessingDrawing" xmlns:wp="http://schemas.openxmlformats.org/drawingml/2006/wordprocessingDrawing" xmlns:w10="urn:schemas-microsoft-com:office:word" xmlns:w="http://schemas.openxmlformats.org/wordprocessingml/2006/main" xmlns:w14="http://schemas.microsoft.com/office/word/2010/wordml" xmlns:w15="http://schemas.microsoft.com/office/word/2012/wordml" xmlns:wpg="http://schemas.microsoft.com/office/word/2010/wordprocessingGroup" xmlns:wpi="http://schemas.microsoft.com/office/word/2010/wordprocessingInk" xmlns:wne="http://schemas.microsoft.com/office/word/2006/wordml" xmlns:wps="http://schemas.microsoft.com/office/word/2010/wordprocessingShape" mc:Ignorable="w14 w15 wp14">
-  <w:footnote w:type="separator" w:id="-1">
-    <w:p>
-      <w:pPr>
-        <w:spacing w:after="0" w:line="240" w:lineRule="auto"/>
-      </w:pPr>
-      <w:r>
-        <w:rPr>
-          <w:rStyle w:val="FootnoteReference"/>
-        </w:rPr>
-        <w:footnoteRef/>
-      </w:r>
-      <w:r>
-        <w:separator/>
-      </w:r>
-    </w:p>
-  </w:footnote>
-  <w:footnote w:type="continuationSeparator" w:id="0">
-    <w:p>
-      <w:pPr>
-        <w:spacing w:after="0" w:line="240" w:lineRule="auto"/>
-      </w:pPr>
-      <w:r>
-        <w:rPr>
-          <w:rStyle w:val="FootnoteReference"/>
-        </w:rPr>
-        <w:footnoteRef/>
-      </w:r>
-      <w:r>
-        <w:continuationSeparator/>
-      </w:r>
-    </w:p>
-  </w:footnote>
-</w:footnotes>
-</file>
-
-<file path=word/numbering.xml><?xml version="1.0" encoding="utf-8"?>
-<w:numbering xmlns:wpc="http://schemas.microsoft.com/office/word/2010/wordprocessingCanvas" xmlns:mc="http://schemas.openxmlformats.org/markup-compatibility/2006" xmlns:o="urn:schemas-microsoft-com:office:office" xmlns:r="http://schemas.openxmlformats.org/officeDocument/2006/relationships" xmlns:m="http://schemas.openxmlformats.org/officeDocument/2006/math" xmlns:v="urn:schemas-microsoft-com:vml" xmlns:wp14="http://schemas.microsoft.com/office/word/2010/wordprocessingDrawing" xmlns:wp="http://schemas.openxmlformats.org/drawingml/2006/wordprocessingDrawing" xmlns:w10="urn:schemas-microsoft-com:office:word" xmlns:w="http://schemas.openxmlformats.org/wordprocessingml/2006/main" xmlns:w14="http://schemas.microsoft.com/office/word/2010/wordml" xmlns:w15="http://schemas.microsoft.com/office/word/2012/wordml" xmlns:wpg="http://schemas.microsoft.com/office/word/2010/wordprocessingGroup" xmlns:wpi="http://schemas.microsoft.com/office/word/2010/wordprocessingInk" xmlns:wne="http://schemas.microsoft.com/office/word/2006/wordml" xmlns:wps="http://schemas.microsoft.com/office/word/2010/wordprocessingShape" mc:Ignorable="w14 w15 wp14">
-  <w:abstractNum w:abstractNumId="1" w15:restartNumberingAfterBreak="0">
-    <w:multiLevelType w:val="hybridMultilevel"/>
-    <w:lvl w:ilvl="0" w15:tentative="1">
-      <w:start w:val="1"/>
-      <w:numFmt w:val="bullet"/>
-      <w:lvlText w:val="●"/>
-      <w:lvlJc w:val="left"/>
-      <w:pPr>
-        <w:ind w:left="720" w:hanging="360"/>
-      </w:pPr>
-    </w:lvl>
-    <w:lvl w:ilvl="1" w15:tentative="1">
-      <w:start w:val="1"/>
-      <w:numFmt w:val="bullet"/>
-      <w:lvlText w:val="○"/>
-      <w:lvlJc w:val="left"/>
-      <w:pPr>
-        <w:ind w:left="1440" w:hanging="360"/>
-      </w:pPr>
-    </w:lvl>
-    <w:lvl w:ilvl="2" w15:tentative="1">
-      <w:start w:val="1"/>
-      <w:numFmt w:val="bullet"/>
-      <w:lvlText w:val="■"/>
-      <w:lvlJc w:val="left"/>
-      <w:pPr>
-        <w:ind w:left="2160" w:hanging="360"/>
-      </w:pPr>
-    </w:lvl>
-    <w:lvl w:ilvl="3" w15:tentative="1">
-      <w:start w:val="1"/>
-      <w:numFmt w:val="bullet"/>
-      <w:lvlText w:val="●"/>
-      <w:lvlJc w:val="left"/>
-      <w:pPr>
-        <w:ind w:left="2880" w:hanging="360"/>
-      </w:pPr>
-    </w:lvl>
-    <w:lvl w:ilvl="4" w15:tentative="1">
-      <w:start w:val="1"/>
-      <w:numFmt w:val="bullet"/>
-      <w:lvlText w:val="○"/>
-      <w:lvlJc w:val="left"/>
-      <w:pPr>
-        <w:ind w:left="3600" w:hanging="360"/>
-      </w:pPr>
-    </w:lvl>
-    <w:lvl w:ilvl="5" w15:tentative="1">
-      <w:start w:val="1"/>
-      <w:numFmt w:val="bullet"/>
-      <w:lvlText w:val="■"/>
-      <w:lvlJc w:val="left"/>
-      <w:pPr>
-        <w:ind w:left="4320" w:hanging="360"/>
-      </w:pPr>
-    </w:lvl>
-    <w:lvl w:ilvl="6" w15:tentative="1">
-      <w:start w:val="1"/>
-      <w:numFmt w:val="bullet"/>
-      <w:lvlText w:val="●"/>
-      <w:lvlJc w:val="left"/>
-      <w:pPr>
-        <w:ind w:left="5040" w:hanging="360"/>
-      </w:pPr>
-    </w:lvl>
-    <w:lvl w:ilvl="7" w15:tentative="1">
-      <w:start w:val="1"/>
-      <w:numFmt w:val="bullet"/>
-      <w:lvlText w:val="●"/>
-      <w:lvlJc w:val="left"/>
-      <w:pPr>
-        <w:ind w:left="5760" w:hanging="360"/>
-      </w:pPr>
-    </w:lvl>
-    <w:lvl w:ilvl="8" w15:tentative="1">
-      <w:start w:val="1"/>
-      <w:numFmt w:val="bullet"/>
-      <w:lvlText w:val="●"/>
-      <w:lvlJc w:val="left"/>
-      <w:pPr>
-        <w:ind w:left="6480" w:hanging="360"/>
-      </w:pPr>
-    </w:lvl>
-  </w:abstractNum>
-  <w:num w:numId="1">
-    <w:abstractNumId w:val="1"/>
-    <w:lvlOverride w:ilvl="0">
-      <w:startOverride w:val="1"/>
-    </w:lvlOverride>
-  </w:num>
-</w:numbering>
-</file>
-
 <file path=word/styles.xml><?xml version="1.0" encoding="utf-8"?>
-<w:styles xmlns:mc="http://schemas.openxmlformats.org/markup-compatibility/2006" xmlns:r="http://schemas.openxmlformats.org/officeDocument/2006/relationships" xmlns:w="http://schemas.openxmlformats.org/wordprocessingml/2006/main" xmlns:w14="http://schemas.microsoft.com/office/word/2010/wordml" xmlns:w15="http://schemas.microsoft.com/office/word/2012/wordml" mc:Ignorable="w14 w15">
-  <w:docDefaults>
-    <w:rPrDefault/>
-    <w:pPrDefault/>
-  </w:docDefaults>
+<w:styles xmlns:w="http://schemas.openxmlformats.org/wordprocessingml/2006/main">
+  <w:style w:type="paragraph" w:default="1" w:styleId="Normal">
+    <w:name w:val="Normal"/>
+    <w:rPr>
+      <w:rFonts w:ascii="Arial" w:hAnsi="Arial"/>
+      <w:sz w:val="22"/>
+    </w:rPr>
+  </w:style>
   <w:style w:type="paragraph" w:styleId="Title">
     <w:name w:val="Title"/>
-    <w:basedOn w:val="Normal"/>
-    <w:next w:val="Normal"/>
-    <w:qFormat/>
     <w:rPr>
-      <w:sz w:val="56"/>
-      <w:szCs w:val="56"/>
+      <w:b/>
+      <w:sz w:val="32"/>
     </w:rPr>
   </w:style>
   <w:style w:type="paragraph" w:styleId="Heading1">
-    <w:name w:val="Heading 1"/>
-    <w:basedOn w:val="Normal"/>
-    <w:next w:val="Normal"/>
-    <w:qFormat/>
+    <w:name w:val="heading 1"/>
     <w:rPr>
-      <w:color w:val="2E74B5"/>
-      <w:sz w:val="32"/>
-      <w:szCs w:val="32"/>
+      <w:b/>
+      <w:sz w:val="28"/>
     </w:rPr>
   </w:style>
   <w:style w:type="paragraph" w:styleId="Heading2">
-    <w:name w:val="Heading 2"/>
-    <w:basedOn w:val="Normal"/>
-    <w:next w:val="Normal"/>
-    <w:qFormat/>
+    <w:name w:val="heading 2"/>
     <w:rPr>
-      <w:color w:val="2E74B5"/>
-      <w:sz w:val="26"/>
-      <w:szCs w:val="26"/>
+      <w:b/>
+      <w:sz w:val="24"/>
     </w:rPr>
   </w:style>
   <w:style w:type="paragraph" w:styleId="Heading3">
-    <w:name w:val="Heading 3"/>
-    <w:basedOn w:val="Normal"/>
-    <w:next w:val="Normal"/>
-    <w:qFormat/>
+    <w:name w:val="heading 3"/>
     <w:rPr>
-      <w:color w:val="1F4D78"/>
-      <w:sz w:val="24"/>
-      <w:szCs w:val="24"/>
+      <w:b/>
+      <w:sz w:val="22"/>
     </w:rPr>
   </w:style>
-  <w:style w:type="paragraph" w:styleId="Heading4">
-    <w:name w:val="Heading 4"/>
-    <w:basedOn w:val="Normal"/>
-    <w:next w:val="Normal"/>
-    <w:qFormat/>
+  <w:style w:type="paragraph" w:styleId="Code">
+    <w:name w:val="Code"/>
     <w:rPr>
-      <w:i/>
-      <w:iCs/>
-      <w:color w:val="2E74B5"/>
-    </w:rPr>
-  </w:style>
-  <w:style w:type="paragraph" w:styleId="Heading5">
-    <w:name w:val="Heading 5"/>
-    <w:basedOn w:val="Normal"/>
-    <w:next w:val="Normal"/>
-    <w:qFormat/>
-    <w:rPr>
-      <w:color w:val="2E74B5"/>
-    </w:rPr>
-  </w:style>
-  <w:style w:type="paragraph" w:styleId="Heading6">
-    <w:name w:val="Heading 6"/>
-    <w:basedOn w:val="Normal"/>
-    <w:next w:val="Normal"/>
-    <w:qFormat/>
-    <w:rPr>
-      <w:color w:val="1F4D78"/>
-    </w:rPr>
-  </w:style>
-  <w:style w:type="paragraph" w:styleId="Strong">
-    <w:name w:val="Strong"/>
-    <w:basedOn w:val="Normal"/>
-    <w:next w:val="Normal"/>
-    <w:qFormat/>
-    <w:rPr>
-      <w:b/>
-      <w:bCs/>
-    </w:rPr>
-  </w:style>
-  <w:style w:type="paragraph" w:styleId="ListParagraph">
-    <w:name w:val="List Paragraph"/>
-    <w:basedOn w:val="Normal"/>
-    <w:qFormat/>
-  </w:style>
-  <w:style w:type="character" w:styleId="Hyperlink">
-    <w:name w:val="Hyperlink"/>
-    <w:basedOn w:val="DefaultParagraphFont"/>
-    <w:uiPriority w:val="99"/>
-    <w:unhideWhenUsed/>
-    <w:rPr>
-      <w:color w:val="0563C1"/>
-      <w:u w:val="single"/>
-    </w:rPr>
-  </w:style>
-  <w:style w:type="character" w:styleId="FootnoteReference">
-    <w:name w:val="footnote reference"/>
-    <w:basedOn w:val="DefaultParagraphFont"/>
-    <w:uiPriority w:val="99"/>
-    <w:semiHidden/>
-    <w:unhideWhenUsed/>
-    <w:rPr>
-      <w:vertAlign w:val="superscript"/>
-    </w:rPr>
-  </w:style>
-  <w:style w:type="paragraph" w:styleId="FootnoteText">
-    <w:name w:val="footnote text"/>
-    <w:basedOn w:val="Normal"/>
-    <w:link w:val="FootnoteTextChar"/>
-    <w:uiPriority w:val="99"/>
-    <w:semiHidden/>
-    <w:unhideWhenUsed/>
-    <w:pPr>
-      <w:spacing w:after="0" w:line="240" w:lineRule="auto"/>
-    </w:pPr>
-    <w:rPr>
+      <w:rFonts w:ascii="Consolas" w:hAnsi="Consolas"/>
       <w:sz w:val="20"/>
-      <w:szCs w:val="20"/>
-    </w:rPr>
-  </w:style>
-  <w:style w:type="character" w:styleId="FootnoteTextChar">
-    <w:name w:val="Footnote Text Char"/>
-    <w:basedOn w:val="DefaultParagraphFont"/>
-    <w:link w:val="FootnoteText"/>
-    <w:uiPriority w:val="99"/>
-    <w:semiHidden/>
-    <w:unhideWhenUsed/>
-    <w:rPr>
-      <w:sz w:val="20"/>
-      <w:szCs w:val="20"/>
     </w:rPr>
   </w:style>
 </w:styles>

</xml_diff>